<commit_message>
understood about programming and how c++ is useful
</commit_message>
<xml_diff>
--- a/C++ REBOOT NOTES/C++ NOTES.docx
+++ b/C++ REBOOT NOTES/C++ NOTES.docx
@@ -7,8 +7,8 @@
         <w:rPr>
           <w:b/>
           <w:bCs/>
-          <w:sz w:val="36"/>
-          <w:szCs w:val="36"/>
+          <w:sz w:val="40"/>
+          <w:szCs w:val="40"/>
           <w:u w:val="single"/>
         </w:rPr>
       </w:pPr>
@@ -16,11 +16,1959 @@
         <w:rPr>
           <w:b/>
           <w:bCs/>
-          <w:sz w:val="36"/>
-          <w:szCs w:val="36"/>
+          <w:sz w:val="40"/>
+          <w:szCs w:val="40"/>
           <w:u w:val="single"/>
         </w:rPr>
         <w:t>C++ NOTES (1)</w:t>
+      </w:r>
+    </w:p>
+    <w:p>
+      <w:pPr>
+        <w:rPr>
+          <w:b/>
+          <w:bCs/>
+        </w:rPr>
+      </w:pPr>
+      <w:r>
+        <w:rPr>
+          <w:b/>
+          <w:bCs/>
+        </w:rPr>
+        <w:t>1. Programming Language Kya Hai?</w:t>
+      </w:r>
+    </w:p>
+    <w:p>
+      <w:r>
+        <w:t xml:space="preserve">Computer </w:t>
+      </w:r>
+      <w:proofErr w:type="spellStart"/>
+      <w:r>
+        <w:t>humari</w:t>
+      </w:r>
+      <w:proofErr w:type="spellEnd"/>
+      <w:r>
+        <w:t xml:space="preserve"> normal bhasha (Hindi/English) </w:t>
+      </w:r>
+      <w:proofErr w:type="spellStart"/>
+      <w:r>
+        <w:t>nahi</w:t>
+      </w:r>
+      <w:proofErr w:type="spellEnd"/>
+      <w:r>
+        <w:t xml:space="preserve"> </w:t>
+      </w:r>
+      <w:proofErr w:type="spellStart"/>
+      <w:r>
+        <w:t>samajhta</w:t>
+      </w:r>
+      <w:proofErr w:type="spellEnd"/>
+      <w:r>
+        <w:t xml:space="preserve">. Computer ek electronic machine </w:t>
+      </w:r>
+      <w:proofErr w:type="spellStart"/>
+      <w:r>
+        <w:t>hai</w:t>
+      </w:r>
+      <w:proofErr w:type="spellEnd"/>
+      <w:r>
+        <w:t xml:space="preserve"> jo </w:t>
+      </w:r>
+      <w:proofErr w:type="spellStart"/>
+      <w:r>
+        <w:t>sirf</w:t>
+      </w:r>
+      <w:proofErr w:type="spellEnd"/>
+      <w:r>
+        <w:t xml:space="preserve"> </w:t>
+      </w:r>
+      <w:r>
+        <w:rPr>
+          <w:b/>
+          <w:bCs/>
+        </w:rPr>
+        <w:t>Electricity ON (1)</w:t>
+      </w:r>
+      <w:r>
+        <w:t xml:space="preserve"> aur </w:t>
+      </w:r>
+      <w:r>
+        <w:rPr>
+          <w:b/>
+          <w:bCs/>
+        </w:rPr>
+        <w:t>Electricity OFF (0)</w:t>
+      </w:r>
+      <w:r>
+        <w:t xml:space="preserve"> </w:t>
+      </w:r>
+      <w:proofErr w:type="spellStart"/>
+      <w:r>
+        <w:t>samajhti</w:t>
+      </w:r>
+      <w:proofErr w:type="spellEnd"/>
+      <w:r>
+        <w:t xml:space="preserve"> </w:t>
+      </w:r>
+      <w:proofErr w:type="spellStart"/>
+      <w:r>
+        <w:t>hai</w:t>
+      </w:r>
+      <w:proofErr w:type="spellEnd"/>
+      <w:r>
+        <w:t xml:space="preserve">, </w:t>
+      </w:r>
+      <w:proofErr w:type="spellStart"/>
+      <w:r>
+        <w:t>jise</w:t>
+      </w:r>
+      <w:proofErr w:type="spellEnd"/>
+      <w:r>
+        <w:t xml:space="preserve"> hum </w:t>
+      </w:r>
+      <w:r>
+        <w:rPr>
+          <w:b/>
+          <w:bCs/>
+        </w:rPr>
+        <w:t>Binary Language</w:t>
+      </w:r>
+      <w:r>
+        <w:t xml:space="preserve"> </w:t>
+      </w:r>
+      <w:proofErr w:type="spellStart"/>
+      <w:r>
+        <w:t>kehte</w:t>
+      </w:r>
+      <w:proofErr w:type="spellEnd"/>
+      <w:r>
+        <w:t xml:space="preserve"> hain.</w:t>
+      </w:r>
+    </w:p>
+    <w:p>
+      <w:pPr>
+        <w:numPr>
+          <w:ilvl w:val="0"/>
+          <w:numId w:val="6"/>
+        </w:numPr>
+      </w:pPr>
+      <w:r>
+        <w:rPr>
+          <w:b/>
+          <w:bCs/>
+        </w:rPr>
+        <w:t>Problem:</w:t>
+      </w:r>
+      <w:r>
+        <w:t xml:space="preserve"> Agar </w:t>
+      </w:r>
+      <w:proofErr w:type="spellStart"/>
+      <w:r>
+        <w:t>humein</w:t>
+      </w:r>
+      <w:proofErr w:type="spellEnd"/>
+      <w:r>
+        <w:t xml:space="preserve"> computer ko </w:t>
+      </w:r>
+      <w:proofErr w:type="spellStart"/>
+      <w:r>
+        <w:t>bolna</w:t>
+      </w:r>
+      <w:proofErr w:type="spellEnd"/>
+      <w:r>
+        <w:t xml:space="preserve"> </w:t>
+      </w:r>
+      <w:proofErr w:type="spellStart"/>
+      <w:r>
+        <w:t>hai</w:t>
+      </w:r>
+      <w:proofErr w:type="spellEnd"/>
+      <w:r>
+        <w:t xml:space="preserve"> "Hello", </w:t>
+      </w:r>
+      <w:proofErr w:type="spellStart"/>
+      <w:r>
+        <w:t>toh</w:t>
+      </w:r>
+      <w:proofErr w:type="spellEnd"/>
+      <w:r>
+        <w:t xml:space="preserve"> </w:t>
+      </w:r>
+      <w:proofErr w:type="spellStart"/>
+      <w:r>
+        <w:t>humein</w:t>
+      </w:r>
+      <w:proofErr w:type="spellEnd"/>
+      <w:r>
+        <w:t xml:space="preserve"> </w:t>
+      </w:r>
+      <w:proofErr w:type="spellStart"/>
+      <w:r>
+        <w:t>hazaron</w:t>
+      </w:r>
+      <w:proofErr w:type="spellEnd"/>
+      <w:r>
+        <w:t xml:space="preserve"> </w:t>
+      </w:r>
+      <w:proofErr w:type="spellStart"/>
+      <w:r>
+        <w:t>baar</w:t>
+      </w:r>
+      <w:proofErr w:type="spellEnd"/>
+      <w:r>
+        <w:t xml:space="preserve"> 010101 </w:t>
+      </w:r>
+      <w:proofErr w:type="spellStart"/>
+      <w:r>
+        <w:t>likhna</w:t>
+      </w:r>
+      <w:proofErr w:type="spellEnd"/>
+      <w:r>
+        <w:t xml:space="preserve"> </w:t>
+      </w:r>
+      <w:proofErr w:type="spellStart"/>
+      <w:r>
+        <w:t>padega</w:t>
+      </w:r>
+      <w:proofErr w:type="spellEnd"/>
+      <w:r>
+        <w:t xml:space="preserve">, jo </w:t>
+      </w:r>
+      <w:proofErr w:type="spellStart"/>
+      <w:r>
+        <w:t>insaan</w:t>
+      </w:r>
+      <w:proofErr w:type="spellEnd"/>
+      <w:r>
+        <w:t xml:space="preserve"> </w:t>
+      </w:r>
+      <w:proofErr w:type="spellStart"/>
+      <w:r>
+        <w:t>ke</w:t>
+      </w:r>
+      <w:proofErr w:type="spellEnd"/>
+      <w:r>
+        <w:t xml:space="preserve"> </w:t>
+      </w:r>
+      <w:proofErr w:type="spellStart"/>
+      <w:r>
+        <w:t>liye</w:t>
+      </w:r>
+      <w:proofErr w:type="spellEnd"/>
+      <w:r>
+        <w:t xml:space="preserve"> </w:t>
+      </w:r>
+      <w:proofErr w:type="spellStart"/>
+      <w:r>
+        <w:t>namumkin</w:t>
+      </w:r>
+      <w:proofErr w:type="spellEnd"/>
+      <w:r>
+        <w:t xml:space="preserve"> </w:t>
+      </w:r>
+      <w:proofErr w:type="spellStart"/>
+      <w:r>
+        <w:t>hai</w:t>
+      </w:r>
+      <w:proofErr w:type="spellEnd"/>
+      <w:r>
+        <w:t>.</w:t>
+      </w:r>
+    </w:p>
+    <w:p>
+      <w:pPr>
+        <w:numPr>
+          <w:ilvl w:val="0"/>
+          <w:numId w:val="6"/>
+        </w:numPr>
+      </w:pPr>
+      <w:r>
+        <w:rPr>
+          <w:b/>
+          <w:bCs/>
+        </w:rPr>
+        <w:t>Solution:</w:t>
+      </w:r>
+      <w:r>
+        <w:t xml:space="preserve"> </w:t>
+      </w:r>
+      <w:proofErr w:type="spellStart"/>
+      <w:r>
+        <w:t>Humne</w:t>
+      </w:r>
+      <w:proofErr w:type="spellEnd"/>
+      <w:r>
+        <w:t xml:space="preserve"> "High-level languages" </w:t>
+      </w:r>
+      <w:proofErr w:type="spellStart"/>
+      <w:r>
+        <w:t>banayi</w:t>
+      </w:r>
+      <w:proofErr w:type="spellEnd"/>
+      <w:r>
+        <w:t xml:space="preserve"> (</w:t>
+      </w:r>
+      <w:proofErr w:type="spellStart"/>
+      <w:r>
+        <w:t>jaise</w:t>
+      </w:r>
+      <w:proofErr w:type="spellEnd"/>
+      <w:r>
+        <w:t xml:space="preserve"> C++). Isme hum English </w:t>
+      </w:r>
+      <w:proofErr w:type="spellStart"/>
+      <w:r>
+        <w:t>jaisa</w:t>
+      </w:r>
+      <w:proofErr w:type="spellEnd"/>
+      <w:r>
+        <w:t xml:space="preserve"> code </w:t>
+      </w:r>
+      <w:proofErr w:type="spellStart"/>
+      <w:r>
+        <w:t>likhte</w:t>
+      </w:r>
+      <w:proofErr w:type="spellEnd"/>
+      <w:r>
+        <w:t xml:space="preserve"> hain, aur beech </w:t>
+      </w:r>
+      <w:proofErr w:type="spellStart"/>
+      <w:r>
+        <w:t>mein</w:t>
+      </w:r>
+      <w:proofErr w:type="spellEnd"/>
+      <w:r>
+        <w:t xml:space="preserve"> ek "Translator" (Compiler) </w:t>
+      </w:r>
+      <w:proofErr w:type="spellStart"/>
+      <w:r>
+        <w:t>hota</w:t>
+      </w:r>
+      <w:proofErr w:type="spellEnd"/>
+      <w:r>
+        <w:t xml:space="preserve"> </w:t>
+      </w:r>
+      <w:proofErr w:type="spellStart"/>
+      <w:r>
+        <w:t>hai</w:t>
+      </w:r>
+      <w:proofErr w:type="spellEnd"/>
+      <w:r>
+        <w:t xml:space="preserve"> jo </w:t>
+      </w:r>
+      <w:proofErr w:type="spellStart"/>
+      <w:r>
+        <w:t>hamari</w:t>
+      </w:r>
+      <w:proofErr w:type="spellEnd"/>
+      <w:r>
+        <w:t xml:space="preserve"> </w:t>
+      </w:r>
+      <w:proofErr w:type="spellStart"/>
+      <w:r>
+        <w:t>baat</w:t>
+      </w:r>
+      <w:proofErr w:type="spellEnd"/>
+      <w:r>
+        <w:t xml:space="preserve"> computer ko 0 aur 1 </w:t>
+      </w:r>
+      <w:proofErr w:type="spellStart"/>
+      <w:r>
+        <w:t>mein</w:t>
+      </w:r>
+      <w:proofErr w:type="spellEnd"/>
+      <w:r>
+        <w:t xml:space="preserve"> </w:t>
+      </w:r>
+      <w:proofErr w:type="spellStart"/>
+      <w:r>
+        <w:t>samjha</w:t>
+      </w:r>
+      <w:proofErr w:type="spellEnd"/>
+      <w:r>
+        <w:t xml:space="preserve"> </w:t>
+      </w:r>
+      <w:proofErr w:type="spellStart"/>
+      <w:r>
+        <w:t>deta</w:t>
+      </w:r>
+      <w:proofErr w:type="spellEnd"/>
+      <w:r>
+        <w:t xml:space="preserve"> </w:t>
+      </w:r>
+      <w:proofErr w:type="spellStart"/>
+      <w:r>
+        <w:t>hai</w:t>
+      </w:r>
+      <w:proofErr w:type="spellEnd"/>
+      <w:r>
+        <w:t>.</w:t>
+      </w:r>
+    </w:p>
+    <w:p>
+      <w:pPr>
+        <w:numPr>
+          <w:ilvl w:val="0"/>
+          <w:numId w:val="6"/>
+        </w:numPr>
+      </w:pPr>
+      <w:r>
+        <w:rPr>
+          <w:b/>
+          <w:bCs/>
+        </w:rPr>
+        <w:t>Summary:</w:t>
+      </w:r>
+      <w:r>
+        <w:t xml:space="preserve"> Programming language ek </w:t>
+      </w:r>
+      <w:proofErr w:type="spellStart"/>
+      <w:r>
+        <w:t>zariya</w:t>
+      </w:r>
+      <w:proofErr w:type="spellEnd"/>
+      <w:r>
+        <w:t xml:space="preserve"> (medium) </w:t>
+      </w:r>
+      <w:proofErr w:type="spellStart"/>
+      <w:r>
+        <w:t>hai</w:t>
+      </w:r>
+      <w:proofErr w:type="spellEnd"/>
+      <w:r>
+        <w:t xml:space="preserve"> </w:t>
+      </w:r>
+      <w:proofErr w:type="spellStart"/>
+      <w:r>
+        <w:t>insaan</w:t>
+      </w:r>
+      <w:proofErr w:type="spellEnd"/>
+      <w:r>
+        <w:t xml:space="preserve"> aur computer </w:t>
+      </w:r>
+      <w:proofErr w:type="spellStart"/>
+      <w:r>
+        <w:t>ke</w:t>
+      </w:r>
+      <w:proofErr w:type="spellEnd"/>
+      <w:r>
+        <w:t xml:space="preserve"> beech communication ka.</w:t>
+      </w:r>
+    </w:p>
+    <w:p>
+      <w:r>
+        <w:drawing>
+          <wp:inline distT="0" distB="0" distL="0" distR="0" wp14:anchorId="5E327917" wp14:editId="5289C7AA">
+            <wp:extent cx="5731510" cy="2280920"/>
+            <wp:effectExtent l="0" t="0" r="2540" b="5080"/>
+            <wp:docPr id="1226192341" name="Picture 1"/>
+            <wp:cNvGraphicFramePr>
+              <a:graphicFrameLocks xmlns:a="http://schemas.openxmlformats.org/drawingml/2006/main" noChangeAspect="1"/>
+            </wp:cNvGraphicFramePr>
+            <a:graphic xmlns:a="http://schemas.openxmlformats.org/drawingml/2006/main">
+              <a:graphicData uri="http://schemas.openxmlformats.org/drawingml/2006/picture">
+                <pic:pic xmlns:pic="http://schemas.openxmlformats.org/drawingml/2006/picture">
+                  <pic:nvPicPr>
+                    <pic:cNvPr id="1226192341" name=""/>
+                    <pic:cNvPicPr/>
+                  </pic:nvPicPr>
+                  <pic:blipFill>
+                    <a:blip r:embed="rId5"/>
+                    <a:stretch>
+                      <a:fillRect/>
+                    </a:stretch>
+                  </pic:blipFill>
+                  <pic:spPr>
+                    <a:xfrm>
+                      <a:off x="0" y="0"/>
+                      <a:ext cx="5731510" cy="2280920"/>
+                    </a:xfrm>
+                    <a:prstGeom prst="rect">
+                      <a:avLst/>
+                    </a:prstGeom>
+                  </pic:spPr>
+                </pic:pic>
+              </a:graphicData>
+            </a:graphic>
+          </wp:inline>
+        </w:drawing>
+      </w:r>
+      <w:r>
+        <w:pict w14:anchorId="43D017AD">
+          <v:rect id="_x0000_i1049" style="width:0;height:1.5pt" o:hralign="center" o:hrstd="t" o:hr="t" fillcolor="#a0a0a0" stroked="f"/>
+        </w:pict>
+      </w:r>
+    </w:p>
+    <w:p>
+      <w:pPr>
+        <w:rPr>
+          <w:b/>
+          <w:bCs/>
+        </w:rPr>
+      </w:pPr>
+      <w:r>
+        <w:rPr>
+          <w:b/>
+          <w:bCs/>
+        </w:rPr>
+        <w:t>2. C++ Kya Hai aur Iska Significance?</w:t>
+      </w:r>
+    </w:p>
+    <w:p>
+      <w:r>
+        <w:t xml:space="preserve">C++ ko Bjarne Stroustrup ne 1979 </w:t>
+      </w:r>
+      <w:proofErr w:type="spellStart"/>
+      <w:r>
+        <w:t>mein</w:t>
+      </w:r>
+      <w:proofErr w:type="spellEnd"/>
+      <w:r>
+        <w:t xml:space="preserve"> </w:t>
+      </w:r>
+      <w:proofErr w:type="spellStart"/>
+      <w:r>
+        <w:t>banaya</w:t>
+      </w:r>
+      <w:proofErr w:type="spellEnd"/>
+      <w:r>
+        <w:t xml:space="preserve"> </w:t>
+      </w:r>
+      <w:proofErr w:type="spellStart"/>
+      <w:r>
+        <w:t>tha</w:t>
+      </w:r>
+      <w:proofErr w:type="spellEnd"/>
+      <w:r>
+        <w:t xml:space="preserve">. Ye ek </w:t>
+      </w:r>
+      <w:r>
+        <w:rPr>
+          <w:b/>
+          <w:bCs/>
+        </w:rPr>
+        <w:t>Middle-Level Language</w:t>
+      </w:r>
+      <w:r>
+        <w:t xml:space="preserve"> </w:t>
+      </w:r>
+      <w:proofErr w:type="spellStart"/>
+      <w:r>
+        <w:t>maani</w:t>
+      </w:r>
+      <w:proofErr w:type="spellEnd"/>
+      <w:r>
+        <w:t xml:space="preserve"> jati </w:t>
+      </w:r>
+      <w:proofErr w:type="spellStart"/>
+      <w:r>
+        <w:t>hai</w:t>
+      </w:r>
+      <w:proofErr w:type="spellEnd"/>
+      <w:r>
+        <w:t xml:space="preserve"> </w:t>
+      </w:r>
+      <w:proofErr w:type="spellStart"/>
+      <w:r>
+        <w:t>kyunki</w:t>
+      </w:r>
+      <w:proofErr w:type="spellEnd"/>
+      <w:r>
+        <w:t xml:space="preserve"> </w:t>
+      </w:r>
+      <w:proofErr w:type="spellStart"/>
+      <w:r>
+        <w:t>isme</w:t>
+      </w:r>
+      <w:proofErr w:type="spellEnd"/>
+      <w:r>
+        <w:t xml:space="preserve"> High-level features </w:t>
+      </w:r>
+      <w:proofErr w:type="spellStart"/>
+      <w:r>
+        <w:t>bhi</w:t>
+      </w:r>
+      <w:proofErr w:type="spellEnd"/>
+      <w:r>
+        <w:t xml:space="preserve"> hain aur Low-level controls </w:t>
+      </w:r>
+      <w:proofErr w:type="spellStart"/>
+      <w:r>
+        <w:t>bhi</w:t>
+      </w:r>
+      <w:proofErr w:type="spellEnd"/>
+      <w:r>
+        <w:t>.</w:t>
+      </w:r>
+    </w:p>
+    <w:p>
+      <w:pPr>
+        <w:numPr>
+          <w:ilvl w:val="0"/>
+          <w:numId w:val="7"/>
+        </w:numPr>
+      </w:pPr>
+      <w:r>
+        <w:rPr>
+          <w:b/>
+          <w:bCs/>
+        </w:rPr>
+        <w:t>High Speed &amp; Performance:</w:t>
+      </w:r>
+      <w:r>
+        <w:t xml:space="preserve"> C++ direct hardware se </w:t>
+      </w:r>
+      <w:proofErr w:type="spellStart"/>
+      <w:r>
+        <w:t>baat</w:t>
+      </w:r>
+      <w:proofErr w:type="spellEnd"/>
+      <w:r>
+        <w:t xml:space="preserve"> </w:t>
+      </w:r>
+      <w:proofErr w:type="spellStart"/>
+      <w:r>
+        <w:t>kar</w:t>
+      </w:r>
+      <w:proofErr w:type="spellEnd"/>
+      <w:r>
+        <w:t xml:space="preserve"> </w:t>
+      </w:r>
+      <w:proofErr w:type="spellStart"/>
+      <w:r>
+        <w:t>sakti</w:t>
+      </w:r>
+      <w:proofErr w:type="spellEnd"/>
+      <w:r>
+        <w:t xml:space="preserve"> </w:t>
+      </w:r>
+      <w:proofErr w:type="spellStart"/>
+      <w:r>
+        <w:t>hai</w:t>
+      </w:r>
+      <w:proofErr w:type="spellEnd"/>
+      <w:r>
+        <w:t xml:space="preserve">, </w:t>
+      </w:r>
+      <w:proofErr w:type="spellStart"/>
+      <w:r>
+        <w:t>isliye</w:t>
+      </w:r>
+      <w:proofErr w:type="spellEnd"/>
+      <w:r>
+        <w:t xml:space="preserve"> ye </w:t>
+      </w:r>
+      <w:proofErr w:type="spellStart"/>
+      <w:r>
+        <w:t>bohot</w:t>
+      </w:r>
+      <w:proofErr w:type="spellEnd"/>
+      <w:r>
+        <w:t xml:space="preserve"> fast </w:t>
+      </w:r>
+      <w:proofErr w:type="spellStart"/>
+      <w:r>
+        <w:t>hai</w:t>
+      </w:r>
+      <w:proofErr w:type="spellEnd"/>
+      <w:r>
+        <w:t xml:space="preserve">. Iska use </w:t>
+      </w:r>
+      <w:proofErr w:type="spellStart"/>
+      <w:r>
+        <w:t>waha</w:t>
+      </w:r>
+      <w:proofErr w:type="spellEnd"/>
+      <w:r>
+        <w:t xml:space="preserve"> </w:t>
+      </w:r>
+      <w:proofErr w:type="spellStart"/>
+      <w:r>
+        <w:t>hota</w:t>
+      </w:r>
+      <w:proofErr w:type="spellEnd"/>
+      <w:r>
+        <w:t xml:space="preserve"> </w:t>
+      </w:r>
+      <w:proofErr w:type="spellStart"/>
+      <w:r>
+        <w:t>hai</w:t>
+      </w:r>
+      <w:proofErr w:type="spellEnd"/>
+      <w:r>
+        <w:t xml:space="preserve"> </w:t>
+      </w:r>
+      <w:proofErr w:type="spellStart"/>
+      <w:r>
+        <w:t>jaha</w:t>
+      </w:r>
+      <w:proofErr w:type="spellEnd"/>
+      <w:r>
+        <w:t xml:space="preserve"> speed </w:t>
+      </w:r>
+      <w:proofErr w:type="spellStart"/>
+      <w:r>
+        <w:t>sabse</w:t>
+      </w:r>
+      <w:proofErr w:type="spellEnd"/>
+      <w:r>
+        <w:t xml:space="preserve"> </w:t>
+      </w:r>
+      <w:proofErr w:type="spellStart"/>
+      <w:r>
+        <w:t>zyada</w:t>
+      </w:r>
+      <w:proofErr w:type="spellEnd"/>
+      <w:r>
+        <w:t xml:space="preserve"> </w:t>
+      </w:r>
+      <w:proofErr w:type="spellStart"/>
+      <w:r>
+        <w:t>chahiye</w:t>
+      </w:r>
+      <w:proofErr w:type="spellEnd"/>
+      <w:r>
+        <w:t xml:space="preserve">, </w:t>
+      </w:r>
+      <w:proofErr w:type="spellStart"/>
+      <w:r>
+        <w:t>jaise</w:t>
+      </w:r>
+      <w:proofErr w:type="spellEnd"/>
+      <w:r>
+        <w:t xml:space="preserve"> High-end Games (Unreal Engine C++ pe </w:t>
+      </w:r>
+      <w:proofErr w:type="spellStart"/>
+      <w:r>
+        <w:t>chalta</w:t>
+      </w:r>
+      <w:proofErr w:type="spellEnd"/>
+      <w:r>
+        <w:t xml:space="preserve"> </w:t>
+      </w:r>
+      <w:proofErr w:type="spellStart"/>
+      <w:r>
+        <w:t>hai</w:t>
+      </w:r>
+      <w:proofErr w:type="spellEnd"/>
+      <w:r>
+        <w:t>).</w:t>
+      </w:r>
+    </w:p>
+    <w:p>
+      <w:pPr>
+        <w:numPr>
+          <w:ilvl w:val="0"/>
+          <w:numId w:val="7"/>
+        </w:numPr>
+      </w:pPr>
+      <w:r>
+        <w:rPr>
+          <w:b/>
+          <w:bCs/>
+        </w:rPr>
+        <w:t>Memory Management:</w:t>
+      </w:r>
+      <w:r>
+        <w:t xml:space="preserve"> Pointers </w:t>
+      </w:r>
+      <w:proofErr w:type="spellStart"/>
+      <w:r>
+        <w:t>ke</w:t>
+      </w:r>
+      <w:proofErr w:type="spellEnd"/>
+      <w:r>
+        <w:t xml:space="preserve"> </w:t>
+      </w:r>
+      <w:proofErr w:type="spellStart"/>
+      <w:r>
+        <w:t>zariye</w:t>
+      </w:r>
+      <w:proofErr w:type="spellEnd"/>
+      <w:r>
+        <w:t xml:space="preserve"> tum memory </w:t>
+      </w:r>
+      <w:proofErr w:type="spellStart"/>
+      <w:r>
+        <w:t>ke</w:t>
+      </w:r>
+      <w:proofErr w:type="spellEnd"/>
+      <w:r>
+        <w:t xml:space="preserve"> ek-ek byte ko control </w:t>
+      </w:r>
+      <w:proofErr w:type="spellStart"/>
+      <w:r>
+        <w:t>kar</w:t>
+      </w:r>
+      <w:proofErr w:type="spellEnd"/>
+      <w:r>
+        <w:t xml:space="preserve"> </w:t>
+      </w:r>
+      <w:proofErr w:type="spellStart"/>
+      <w:r>
+        <w:t>sakte</w:t>
+      </w:r>
+      <w:proofErr w:type="spellEnd"/>
+      <w:r>
+        <w:t xml:space="preserve"> ho.</w:t>
+      </w:r>
+    </w:p>
+    <w:p>
+      <w:pPr>
+        <w:numPr>
+          <w:ilvl w:val="0"/>
+          <w:numId w:val="7"/>
+        </w:numPr>
+      </w:pPr>
+      <w:r>
+        <w:rPr>
+          <w:b/>
+          <w:bCs/>
+        </w:rPr>
+        <w:t>Standard Template Library (STL):</w:t>
+      </w:r>
+      <w:r>
+        <w:t xml:space="preserve"> C++ </w:t>
+      </w:r>
+      <w:proofErr w:type="spellStart"/>
+      <w:r>
+        <w:t>mein</w:t>
+      </w:r>
+      <w:proofErr w:type="spellEnd"/>
+      <w:r>
+        <w:t xml:space="preserve"> </w:t>
+      </w:r>
+      <w:proofErr w:type="spellStart"/>
+      <w:r>
+        <w:t>pehle</w:t>
+      </w:r>
+      <w:proofErr w:type="spellEnd"/>
+      <w:r>
+        <w:t xml:space="preserve"> se bane-</w:t>
+      </w:r>
+      <w:proofErr w:type="spellStart"/>
+      <w:r>
+        <w:t>banaye</w:t>
+      </w:r>
+      <w:proofErr w:type="spellEnd"/>
+      <w:r>
+        <w:t xml:space="preserve"> containers aur algorithms </w:t>
+      </w:r>
+      <w:proofErr w:type="spellStart"/>
+      <w:r>
+        <w:t>milte</w:t>
+      </w:r>
+      <w:proofErr w:type="spellEnd"/>
+      <w:r>
+        <w:t xml:space="preserve"> hain (</w:t>
+      </w:r>
+      <w:proofErr w:type="spellStart"/>
+      <w:r>
+        <w:t>jaise</w:t>
+      </w:r>
+      <w:proofErr w:type="spellEnd"/>
+      <w:r>
+        <w:t xml:space="preserve"> Vectors, Stacks), jo coding ko fast </w:t>
+      </w:r>
+      <w:proofErr w:type="spellStart"/>
+      <w:r>
+        <w:t>banate</w:t>
+      </w:r>
+      <w:proofErr w:type="spellEnd"/>
+      <w:r>
+        <w:t xml:space="preserve"> hain.</w:t>
+      </w:r>
+    </w:p>
+    <w:p>
+      <w:pPr>
+        <w:numPr>
+          <w:ilvl w:val="0"/>
+          <w:numId w:val="7"/>
+        </w:numPr>
+      </w:pPr>
+      <w:r>
+        <w:rPr>
+          <w:b/>
+          <w:bCs/>
+        </w:rPr>
+        <w:lastRenderedPageBreak/>
+        <w:t>Real World Use:</w:t>
+      </w:r>
+      <w:r>
+        <w:t xml:space="preserve"> Browsers (Chrome, Firefox), Operating Systems (Windows ka </w:t>
+      </w:r>
+      <w:proofErr w:type="spellStart"/>
+      <w:r>
+        <w:t>bada</w:t>
+      </w:r>
+      <w:proofErr w:type="spellEnd"/>
+      <w:r>
+        <w:t xml:space="preserve"> </w:t>
+      </w:r>
+      <w:proofErr w:type="spellStart"/>
+      <w:r>
+        <w:t>hissa</w:t>
+      </w:r>
+      <w:proofErr w:type="spellEnd"/>
+      <w:r>
+        <w:t xml:space="preserve">), aur Adobe </w:t>
+      </w:r>
+      <w:proofErr w:type="spellStart"/>
+      <w:r>
+        <w:t>softwares</w:t>
+      </w:r>
+      <w:proofErr w:type="spellEnd"/>
+      <w:r>
+        <w:t xml:space="preserve"> C++ </w:t>
+      </w:r>
+      <w:proofErr w:type="spellStart"/>
+      <w:r>
+        <w:t>mein</w:t>
+      </w:r>
+      <w:proofErr w:type="spellEnd"/>
+      <w:r>
+        <w:t xml:space="preserve"> </w:t>
+      </w:r>
+      <w:proofErr w:type="spellStart"/>
+      <w:r>
+        <w:t>likhe</w:t>
+      </w:r>
+      <w:proofErr w:type="spellEnd"/>
+      <w:r>
+        <w:t xml:space="preserve"> </w:t>
+      </w:r>
+      <w:proofErr w:type="spellStart"/>
+      <w:r>
+        <w:t>gaye</w:t>
+      </w:r>
+      <w:proofErr w:type="spellEnd"/>
+      <w:r>
+        <w:t xml:space="preserve"> hain.</w:t>
+      </w:r>
+    </w:p>
+    <w:p>
+      <w:r>
+        <w:drawing>
+          <wp:inline distT="0" distB="0" distL="0" distR="0" wp14:anchorId="48B15B40" wp14:editId="4D489521">
+            <wp:extent cx="5731510" cy="1730375"/>
+            <wp:effectExtent l="0" t="0" r="2540" b="3175"/>
+            <wp:docPr id="449568419" name="Picture 1"/>
+            <wp:cNvGraphicFramePr>
+              <a:graphicFrameLocks xmlns:a="http://schemas.openxmlformats.org/drawingml/2006/main" noChangeAspect="1"/>
+            </wp:cNvGraphicFramePr>
+            <a:graphic xmlns:a="http://schemas.openxmlformats.org/drawingml/2006/main">
+              <a:graphicData uri="http://schemas.openxmlformats.org/drawingml/2006/picture">
+                <pic:pic xmlns:pic="http://schemas.openxmlformats.org/drawingml/2006/picture">
+                  <pic:nvPicPr>
+                    <pic:cNvPr id="449568419" name=""/>
+                    <pic:cNvPicPr/>
+                  </pic:nvPicPr>
+                  <pic:blipFill>
+                    <a:blip r:embed="rId6"/>
+                    <a:stretch>
+                      <a:fillRect/>
+                    </a:stretch>
+                  </pic:blipFill>
+                  <pic:spPr>
+                    <a:xfrm>
+                      <a:off x="0" y="0"/>
+                      <a:ext cx="5731510" cy="1730375"/>
+                    </a:xfrm>
+                    <a:prstGeom prst="rect">
+                      <a:avLst/>
+                    </a:prstGeom>
+                  </pic:spPr>
+                </pic:pic>
+              </a:graphicData>
+            </a:graphic>
+          </wp:inline>
+        </w:drawing>
+      </w:r>
+      <w:r>
+        <w:t xml:space="preserve"> </w:t>
+      </w:r>
+      <w:r>
+        <w:pict w14:anchorId="21291BEB">
+          <v:rect id="_x0000_i1050" style="width:0;height:1.5pt" o:hralign="center" o:hrstd="t" o:hr="t" fillcolor="#a0a0a0" stroked="f"/>
+        </w:pict>
+      </w:r>
+    </w:p>
+    <w:p>
+      <w:pPr>
+        <w:rPr>
+          <w:b/>
+          <w:bCs/>
+        </w:rPr>
+      </w:pPr>
+      <w:r>
+        <w:rPr>
+          <w:b/>
+          <w:bCs/>
+        </w:rPr>
+        <w:t xml:space="preserve">3. Compilation Process (Source Code se Executable </w:t>
+      </w:r>
+      <w:proofErr w:type="spellStart"/>
+      <w:r>
+        <w:rPr>
+          <w:b/>
+          <w:bCs/>
+        </w:rPr>
+        <w:t>tak</w:t>
+      </w:r>
+      <w:proofErr w:type="spellEnd"/>
+      <w:r>
+        <w:rPr>
+          <w:b/>
+          <w:bCs/>
+        </w:rPr>
+        <w:t>)</w:t>
+      </w:r>
+    </w:p>
+    <w:p>
+      <w:r>
+        <w:t xml:space="preserve">Jab tum code </w:t>
+      </w:r>
+      <w:proofErr w:type="spellStart"/>
+      <w:r>
+        <w:t>likhte</w:t>
+      </w:r>
+      <w:proofErr w:type="spellEnd"/>
+      <w:r>
+        <w:t xml:space="preserve"> </w:t>
+      </w:r>
+      <w:proofErr w:type="spellStart"/>
+      <w:r>
+        <w:t>ho</w:t>
+      </w:r>
+      <w:proofErr w:type="spellEnd"/>
+      <w:r>
+        <w:t xml:space="preserve">, </w:t>
+      </w:r>
+      <w:proofErr w:type="spellStart"/>
+      <w:r>
+        <w:t>toh</w:t>
+      </w:r>
+      <w:proofErr w:type="spellEnd"/>
+      <w:r>
+        <w:t xml:space="preserve"> wo </w:t>
+      </w:r>
+      <w:proofErr w:type="spellStart"/>
+      <w:r>
+        <w:t>sirf</w:t>
+      </w:r>
+      <w:proofErr w:type="spellEnd"/>
+      <w:r>
+        <w:t xml:space="preserve"> ek text file </w:t>
+      </w:r>
+      <w:proofErr w:type="spellStart"/>
+      <w:r>
+        <w:t>hoti</w:t>
+      </w:r>
+      <w:proofErr w:type="spellEnd"/>
+      <w:r>
+        <w:t xml:space="preserve"> </w:t>
+      </w:r>
+      <w:proofErr w:type="spellStart"/>
+      <w:r>
+        <w:t>hai</w:t>
+      </w:r>
+      <w:proofErr w:type="spellEnd"/>
+      <w:r>
+        <w:t xml:space="preserve">. Computer </w:t>
+      </w:r>
+      <w:proofErr w:type="spellStart"/>
+      <w:r>
+        <w:t>usse</w:t>
+      </w:r>
+      <w:proofErr w:type="spellEnd"/>
+      <w:r>
+        <w:t xml:space="preserve"> direct </w:t>
+      </w:r>
+      <w:proofErr w:type="spellStart"/>
+      <w:r>
+        <w:t>nahi</w:t>
+      </w:r>
+      <w:proofErr w:type="spellEnd"/>
+      <w:r>
+        <w:t xml:space="preserve"> </w:t>
+      </w:r>
+      <w:proofErr w:type="spellStart"/>
+      <w:r>
+        <w:t>chala</w:t>
+      </w:r>
+      <w:proofErr w:type="spellEnd"/>
+      <w:r>
+        <w:t xml:space="preserve"> </w:t>
+      </w:r>
+      <w:proofErr w:type="spellStart"/>
+      <w:r>
+        <w:t>sakta</w:t>
+      </w:r>
+      <w:proofErr w:type="spellEnd"/>
+      <w:r>
+        <w:t xml:space="preserve">. Iske </w:t>
+      </w:r>
+      <w:proofErr w:type="spellStart"/>
+      <w:r>
+        <w:t>piche</w:t>
+      </w:r>
+      <w:proofErr w:type="spellEnd"/>
+      <w:r>
+        <w:t xml:space="preserve"> 4 bade steps </w:t>
+      </w:r>
+      <w:proofErr w:type="spellStart"/>
+      <w:r>
+        <w:t>hote</w:t>
+      </w:r>
+      <w:proofErr w:type="spellEnd"/>
+      <w:r>
+        <w:t xml:space="preserve"> hain:</w:t>
+      </w:r>
+    </w:p>
+    <w:p>
+      <w:pPr>
+        <w:numPr>
+          <w:ilvl w:val="0"/>
+          <w:numId w:val="8"/>
+        </w:numPr>
+      </w:pPr>
+      <w:r>
+        <w:rPr>
+          <w:b/>
+          <w:bCs/>
+        </w:rPr>
+        <w:t>Pre-processing:</w:t>
+      </w:r>
+      <w:r>
+        <w:t xml:space="preserve"> Sabse </w:t>
+      </w:r>
+      <w:proofErr w:type="spellStart"/>
+      <w:r>
+        <w:t>pehle</w:t>
+      </w:r>
+      <w:proofErr w:type="spellEnd"/>
+      <w:r>
+        <w:t xml:space="preserve"> #include </w:t>
+      </w:r>
+      <w:proofErr w:type="spellStart"/>
+      <w:r>
+        <w:t>wali</w:t>
+      </w:r>
+      <w:proofErr w:type="spellEnd"/>
+      <w:r>
+        <w:t xml:space="preserve"> lines (directives) ko scan </w:t>
+      </w:r>
+      <w:proofErr w:type="spellStart"/>
+      <w:r>
+        <w:t>kiya</w:t>
+      </w:r>
+      <w:proofErr w:type="spellEnd"/>
+      <w:r>
+        <w:t xml:space="preserve"> </w:t>
+      </w:r>
+      <w:proofErr w:type="spellStart"/>
+      <w:r>
+        <w:t>jata</w:t>
+      </w:r>
+      <w:proofErr w:type="spellEnd"/>
+      <w:r>
+        <w:t xml:space="preserve"> </w:t>
+      </w:r>
+      <w:proofErr w:type="spellStart"/>
+      <w:r>
+        <w:t>hai</w:t>
+      </w:r>
+      <w:proofErr w:type="spellEnd"/>
+      <w:r>
+        <w:t xml:space="preserve"> aur </w:t>
+      </w:r>
+      <w:proofErr w:type="spellStart"/>
+      <w:r>
+        <w:t>unka</w:t>
+      </w:r>
+      <w:proofErr w:type="spellEnd"/>
+      <w:r>
+        <w:t xml:space="preserve"> content file </w:t>
+      </w:r>
+      <w:proofErr w:type="spellStart"/>
+      <w:r>
+        <w:t>mein</w:t>
+      </w:r>
+      <w:proofErr w:type="spellEnd"/>
+      <w:r>
+        <w:t xml:space="preserve"> add </w:t>
+      </w:r>
+      <w:proofErr w:type="spellStart"/>
+      <w:r>
+        <w:t>kiya</w:t>
+      </w:r>
+      <w:proofErr w:type="spellEnd"/>
+      <w:r>
+        <w:t xml:space="preserve"> </w:t>
+      </w:r>
+      <w:proofErr w:type="spellStart"/>
+      <w:r>
+        <w:t>jata</w:t>
+      </w:r>
+      <w:proofErr w:type="spellEnd"/>
+      <w:r>
+        <w:t xml:space="preserve"> </w:t>
+      </w:r>
+      <w:proofErr w:type="spellStart"/>
+      <w:r>
+        <w:t>hai</w:t>
+      </w:r>
+      <w:proofErr w:type="spellEnd"/>
+      <w:r>
+        <w:t>.</w:t>
+      </w:r>
+    </w:p>
+    <w:p>
+      <w:pPr>
+        <w:numPr>
+          <w:ilvl w:val="0"/>
+          <w:numId w:val="8"/>
+        </w:numPr>
+      </w:pPr>
+      <w:r>
+        <w:rPr>
+          <w:b/>
+          <w:bCs/>
+        </w:rPr>
+        <w:t>Compilation:</w:t>
+      </w:r>
+      <w:r>
+        <w:t xml:space="preserve"> </w:t>
+      </w:r>
+      <w:proofErr w:type="spellStart"/>
+      <w:r>
+        <w:t>Tumhare</w:t>
+      </w:r>
+      <w:proofErr w:type="spellEnd"/>
+      <w:r>
+        <w:t xml:space="preserve"> "Source Code" ko </w:t>
+      </w:r>
+      <w:r>
+        <w:rPr>
+          <w:b/>
+          <w:bCs/>
+        </w:rPr>
+        <w:t>Assembly Language</w:t>
+      </w:r>
+      <w:r>
+        <w:t xml:space="preserve"> (Low-level language) </w:t>
+      </w:r>
+      <w:proofErr w:type="spellStart"/>
+      <w:r>
+        <w:t>mein</w:t>
+      </w:r>
+      <w:proofErr w:type="spellEnd"/>
+      <w:r>
+        <w:t xml:space="preserve"> convert </w:t>
+      </w:r>
+      <w:proofErr w:type="spellStart"/>
+      <w:r>
+        <w:t>kiya</w:t>
+      </w:r>
+      <w:proofErr w:type="spellEnd"/>
+      <w:r>
+        <w:t xml:space="preserve"> </w:t>
+      </w:r>
+      <w:proofErr w:type="spellStart"/>
+      <w:r>
+        <w:t>jata</w:t>
+      </w:r>
+      <w:proofErr w:type="spellEnd"/>
+      <w:r>
+        <w:t xml:space="preserve"> </w:t>
+      </w:r>
+      <w:proofErr w:type="spellStart"/>
+      <w:r>
+        <w:t>hai</w:t>
+      </w:r>
+      <w:proofErr w:type="spellEnd"/>
+      <w:r>
+        <w:t>.</w:t>
+      </w:r>
+    </w:p>
+    <w:p>
+      <w:pPr>
+        <w:numPr>
+          <w:ilvl w:val="0"/>
+          <w:numId w:val="8"/>
+        </w:numPr>
+      </w:pPr>
+      <w:r>
+        <w:rPr>
+          <w:b/>
+          <w:bCs/>
+        </w:rPr>
+        <w:t>Assembling:</w:t>
+      </w:r>
+      <w:r>
+        <w:t xml:space="preserve"> Assembly code ko </w:t>
+      </w:r>
+      <w:r>
+        <w:rPr>
+          <w:b/>
+          <w:bCs/>
+        </w:rPr>
+        <w:t>Machine Code</w:t>
+      </w:r>
+      <w:r>
+        <w:t xml:space="preserve"> (0s aur 1s) </w:t>
+      </w:r>
+      <w:proofErr w:type="spellStart"/>
+      <w:r>
+        <w:t>mein</w:t>
+      </w:r>
+      <w:proofErr w:type="spellEnd"/>
+      <w:r>
+        <w:t xml:space="preserve"> </w:t>
+      </w:r>
+      <w:proofErr w:type="spellStart"/>
+      <w:r>
+        <w:t>badla</w:t>
+      </w:r>
+      <w:proofErr w:type="spellEnd"/>
+      <w:r>
+        <w:t xml:space="preserve"> </w:t>
+      </w:r>
+      <w:proofErr w:type="spellStart"/>
+      <w:r>
+        <w:t>jata</w:t>
+      </w:r>
+      <w:proofErr w:type="spellEnd"/>
+      <w:r>
+        <w:t xml:space="preserve"> </w:t>
+      </w:r>
+      <w:proofErr w:type="spellStart"/>
+      <w:r>
+        <w:t>hai</w:t>
+      </w:r>
+      <w:proofErr w:type="spellEnd"/>
+      <w:r>
+        <w:t>.</w:t>
+      </w:r>
+    </w:p>
+    <w:p>
+      <w:pPr>
+        <w:numPr>
+          <w:ilvl w:val="0"/>
+          <w:numId w:val="8"/>
+        </w:numPr>
+      </w:pPr>
+      <w:r>
+        <w:rPr>
+          <w:b/>
+          <w:bCs/>
+        </w:rPr>
+        <w:t>Linking:</w:t>
+      </w:r>
+      <w:r>
+        <w:t xml:space="preserve"> Agar </w:t>
+      </w:r>
+      <w:proofErr w:type="spellStart"/>
+      <w:r>
+        <w:t>tumne</w:t>
+      </w:r>
+      <w:proofErr w:type="spellEnd"/>
+      <w:r>
+        <w:t xml:space="preserve"> koi library </w:t>
+      </w:r>
+      <w:proofErr w:type="gramStart"/>
+      <w:r>
+        <w:t>use</w:t>
+      </w:r>
+      <w:proofErr w:type="gramEnd"/>
+      <w:r>
+        <w:t xml:space="preserve"> ki </w:t>
+      </w:r>
+      <w:proofErr w:type="spellStart"/>
+      <w:r>
+        <w:t>hai</w:t>
+      </w:r>
+      <w:proofErr w:type="spellEnd"/>
+      <w:r>
+        <w:t xml:space="preserve"> (</w:t>
+      </w:r>
+      <w:proofErr w:type="spellStart"/>
+      <w:r>
+        <w:t>jaise</w:t>
+      </w:r>
+      <w:proofErr w:type="spellEnd"/>
+      <w:r>
+        <w:t xml:space="preserve"> iostream), </w:t>
+      </w:r>
+      <w:proofErr w:type="spellStart"/>
+      <w:r>
+        <w:t>toh</w:t>
+      </w:r>
+      <w:proofErr w:type="spellEnd"/>
+      <w:r>
+        <w:t xml:space="preserve"> linker un libraries ko </w:t>
+      </w:r>
+      <w:proofErr w:type="spellStart"/>
+      <w:r>
+        <w:t>tumhare</w:t>
+      </w:r>
+      <w:proofErr w:type="spellEnd"/>
+      <w:r>
+        <w:t xml:space="preserve"> code </w:t>
+      </w:r>
+      <w:proofErr w:type="spellStart"/>
+      <w:r>
+        <w:t>ke</w:t>
+      </w:r>
+      <w:proofErr w:type="spellEnd"/>
+      <w:r>
+        <w:t xml:space="preserve"> </w:t>
+      </w:r>
+      <w:proofErr w:type="spellStart"/>
+      <w:r>
+        <w:t>saath</w:t>
+      </w:r>
+      <w:proofErr w:type="spellEnd"/>
+      <w:r>
+        <w:t xml:space="preserve"> </w:t>
+      </w:r>
+      <w:proofErr w:type="spellStart"/>
+      <w:r>
+        <w:t>jod</w:t>
+      </w:r>
+      <w:proofErr w:type="spellEnd"/>
+      <w:r>
+        <w:t xml:space="preserve"> </w:t>
+      </w:r>
+      <w:proofErr w:type="spellStart"/>
+      <w:r>
+        <w:t>kar</w:t>
+      </w:r>
+      <w:proofErr w:type="spellEnd"/>
+      <w:r>
+        <w:t xml:space="preserve"> ek final </w:t>
+      </w:r>
+      <w:r>
+        <w:rPr>
+          <w:b/>
+          <w:bCs/>
+        </w:rPr>
+        <w:t>Executable File (.exe)</w:t>
+      </w:r>
+      <w:r>
+        <w:t xml:space="preserve"> </w:t>
+      </w:r>
+      <w:proofErr w:type="spellStart"/>
+      <w:r>
+        <w:t>bana</w:t>
+      </w:r>
+      <w:proofErr w:type="spellEnd"/>
+      <w:r>
+        <w:t xml:space="preserve"> </w:t>
+      </w:r>
+      <w:proofErr w:type="spellStart"/>
+      <w:r>
+        <w:t>deta</w:t>
+      </w:r>
+      <w:proofErr w:type="spellEnd"/>
+      <w:r>
+        <w:t xml:space="preserve"> </w:t>
+      </w:r>
+      <w:proofErr w:type="spellStart"/>
+      <w:r>
+        <w:t>hai</w:t>
+      </w:r>
+      <w:proofErr w:type="spellEnd"/>
+      <w:r>
+        <w:t>.</w:t>
+      </w:r>
+    </w:p>
+    <w:p>
+      <w:r>
+        <w:pict w14:anchorId="4120D891">
+          <v:rect id="_x0000_i1051" style="width:0;height:1.5pt" o:hralign="center" o:hrstd="t" o:hr="t" fillcolor="#a0a0a0" stroked="f"/>
+        </w:pict>
+      </w:r>
+    </w:p>
+    <w:p>
+      <w:pPr>
+        <w:rPr>
+          <w:b/>
+          <w:bCs/>
+        </w:rPr>
+      </w:pPr>
+      <w:r>
+        <w:rPr>
+          <w:b/>
+          <w:bCs/>
+        </w:rPr>
+        <w:t>4. Compiler vs Interpreter (Extra Point for Interviews)</w:t>
+      </w:r>
+    </w:p>
+    <w:p>
+      <w:r>
+        <w:t xml:space="preserve">Dono ka </w:t>
+      </w:r>
+      <w:proofErr w:type="spellStart"/>
+      <w:r>
+        <w:t>kaam</w:t>
+      </w:r>
+      <w:proofErr w:type="spellEnd"/>
+      <w:r>
+        <w:t xml:space="preserve"> code translate </w:t>
+      </w:r>
+      <w:proofErr w:type="spellStart"/>
+      <w:r>
+        <w:t>karna</w:t>
+      </w:r>
+      <w:proofErr w:type="spellEnd"/>
+      <w:r>
+        <w:t xml:space="preserve"> </w:t>
+      </w:r>
+      <w:proofErr w:type="spellStart"/>
+      <w:r>
+        <w:t>hai</w:t>
+      </w:r>
+      <w:proofErr w:type="spellEnd"/>
+      <w:r>
+        <w:t xml:space="preserve">, par </w:t>
+      </w:r>
+      <w:proofErr w:type="spellStart"/>
+      <w:r>
+        <w:t>tarika</w:t>
+      </w:r>
+      <w:proofErr w:type="spellEnd"/>
+      <w:r>
+        <w:t xml:space="preserve"> </w:t>
+      </w:r>
+      <w:proofErr w:type="spellStart"/>
+      <w:r>
+        <w:t>alag</w:t>
+      </w:r>
+      <w:proofErr w:type="spellEnd"/>
+      <w:r>
+        <w:t xml:space="preserve"> </w:t>
+      </w:r>
+      <w:proofErr w:type="spellStart"/>
+      <w:r>
+        <w:t>hai</w:t>
+      </w:r>
+      <w:proofErr w:type="spellEnd"/>
+      <w:r>
+        <w:t>:</w:t>
+      </w:r>
+    </w:p>
+    <w:p>
+      <w:pPr>
+        <w:numPr>
+          <w:ilvl w:val="0"/>
+          <w:numId w:val="9"/>
+        </w:numPr>
+      </w:pPr>
+      <w:r>
+        <w:rPr>
+          <w:b/>
+          <w:bCs/>
+        </w:rPr>
+        <w:t xml:space="preserve">Compiler (C++ use </w:t>
+      </w:r>
+      <w:proofErr w:type="spellStart"/>
+      <w:r>
+        <w:rPr>
+          <w:b/>
+          <w:bCs/>
+        </w:rPr>
+        <w:t>karti</w:t>
+      </w:r>
+      <w:proofErr w:type="spellEnd"/>
+      <w:r>
+        <w:rPr>
+          <w:b/>
+          <w:bCs/>
+        </w:rPr>
+        <w:t xml:space="preserve"> </w:t>
+      </w:r>
+      <w:proofErr w:type="spellStart"/>
+      <w:r>
+        <w:rPr>
+          <w:b/>
+          <w:bCs/>
+        </w:rPr>
+        <w:t>hai</w:t>
+      </w:r>
+      <w:proofErr w:type="spellEnd"/>
+      <w:r>
+        <w:rPr>
+          <w:b/>
+          <w:bCs/>
+        </w:rPr>
+        <w:t>):</w:t>
+      </w:r>
+      <w:r>
+        <w:t xml:space="preserve"> Ye pura ka pura code ek </w:t>
+      </w:r>
+      <w:proofErr w:type="spellStart"/>
+      <w:r>
+        <w:t>saath</w:t>
+      </w:r>
+      <w:proofErr w:type="spellEnd"/>
+      <w:r>
+        <w:t xml:space="preserve"> scan </w:t>
+      </w:r>
+      <w:proofErr w:type="spellStart"/>
+      <w:r>
+        <w:t>karta</w:t>
+      </w:r>
+      <w:proofErr w:type="spellEnd"/>
+      <w:r>
+        <w:t xml:space="preserve"> </w:t>
+      </w:r>
+      <w:proofErr w:type="spellStart"/>
+      <w:r>
+        <w:t>hai</w:t>
+      </w:r>
+      <w:proofErr w:type="spellEnd"/>
+      <w:r>
+        <w:t xml:space="preserve"> aur error batata </w:t>
+      </w:r>
+      <w:proofErr w:type="spellStart"/>
+      <w:r>
+        <w:t>hai</w:t>
+      </w:r>
+      <w:proofErr w:type="spellEnd"/>
+      <w:r>
+        <w:t xml:space="preserve">. Ye ek </w:t>
+      </w:r>
+      <w:proofErr w:type="spellStart"/>
+      <w:r>
+        <w:t>alag</w:t>
+      </w:r>
+      <w:proofErr w:type="spellEnd"/>
+      <w:r>
+        <w:t xml:space="preserve"> file (.exe) </w:t>
+      </w:r>
+      <w:proofErr w:type="spellStart"/>
+      <w:r>
+        <w:t>banata</w:t>
+      </w:r>
+      <w:proofErr w:type="spellEnd"/>
+      <w:r>
+        <w:t xml:space="preserve"> </w:t>
+      </w:r>
+      <w:proofErr w:type="spellStart"/>
+      <w:r>
+        <w:t>hai</w:t>
+      </w:r>
+      <w:proofErr w:type="spellEnd"/>
+      <w:r>
+        <w:t xml:space="preserve">. </w:t>
+      </w:r>
+      <w:proofErr w:type="spellStart"/>
+      <w:r>
+        <w:t>Isliye</w:t>
+      </w:r>
+      <w:proofErr w:type="spellEnd"/>
+      <w:r>
+        <w:t xml:space="preserve"> C++ fast </w:t>
+      </w:r>
+      <w:proofErr w:type="spellStart"/>
+      <w:r>
+        <w:t>hai</w:t>
+      </w:r>
+      <w:proofErr w:type="spellEnd"/>
+      <w:r>
+        <w:t>.</w:t>
+      </w:r>
+    </w:p>
+    <w:p>
+      <w:pPr>
+        <w:numPr>
+          <w:ilvl w:val="0"/>
+          <w:numId w:val="9"/>
+        </w:numPr>
+      </w:pPr>
+      <w:r>
+        <w:rPr>
+          <w:b/>
+          <w:bCs/>
+        </w:rPr>
+        <w:t xml:space="preserve">Interpreter (Python use </w:t>
+      </w:r>
+      <w:proofErr w:type="spellStart"/>
+      <w:r>
+        <w:rPr>
+          <w:b/>
+          <w:bCs/>
+        </w:rPr>
+        <w:t>karti</w:t>
+      </w:r>
+      <w:proofErr w:type="spellEnd"/>
+      <w:r>
+        <w:rPr>
+          <w:b/>
+          <w:bCs/>
+        </w:rPr>
+        <w:t xml:space="preserve"> </w:t>
+      </w:r>
+      <w:proofErr w:type="spellStart"/>
+      <w:r>
+        <w:rPr>
+          <w:b/>
+          <w:bCs/>
+        </w:rPr>
+        <w:t>hai</w:t>
+      </w:r>
+      <w:proofErr w:type="spellEnd"/>
+      <w:r>
+        <w:rPr>
+          <w:b/>
+          <w:bCs/>
+        </w:rPr>
+        <w:t>):</w:t>
+      </w:r>
+      <w:r>
+        <w:t xml:space="preserve"> Ye code ko line-by-line read aur execute </w:t>
+      </w:r>
+      <w:proofErr w:type="spellStart"/>
+      <w:r>
+        <w:t>karta</w:t>
+      </w:r>
+      <w:proofErr w:type="spellEnd"/>
+      <w:r>
+        <w:t xml:space="preserve"> </w:t>
+      </w:r>
+      <w:proofErr w:type="spellStart"/>
+      <w:r>
+        <w:t>hai</w:t>
+      </w:r>
+      <w:proofErr w:type="spellEnd"/>
+      <w:r>
+        <w:t xml:space="preserve">. Isme koi .exe file </w:t>
+      </w:r>
+      <w:proofErr w:type="spellStart"/>
+      <w:r>
+        <w:t>nahi</w:t>
+      </w:r>
+      <w:proofErr w:type="spellEnd"/>
+      <w:r>
+        <w:t xml:space="preserve"> </w:t>
+      </w:r>
+      <w:proofErr w:type="spellStart"/>
+      <w:r>
+        <w:t>banti</w:t>
+      </w:r>
+      <w:proofErr w:type="spellEnd"/>
+      <w:r>
+        <w:t>.</w:t>
+      </w:r>
+    </w:p>
+    <w:p>
+      <w:r>
+        <w:pict w14:anchorId="2421167B">
+          <v:rect id="_x0000_i1052" style="width:0;height:1.5pt" o:hralign="center" o:hrstd="t" o:hr="t" fillcolor="#a0a0a0" stroked="f"/>
+        </w:pict>
+      </w:r>
+    </w:p>
+    <w:p>
+      <w:pPr>
+        <w:rPr>
+          <w:b/>
+          <w:bCs/>
+        </w:rPr>
+      </w:pPr>
+      <w:r>
+        <w:rPr>
+          <w:b/>
+          <w:bCs/>
+        </w:rPr>
+        <w:t>5. C++ Case Sensitivity</w:t>
+      </w:r>
+    </w:p>
+    <w:p>
+      <w:r>
+        <w:t xml:space="preserve">Hamesha </w:t>
+      </w:r>
+      <w:proofErr w:type="spellStart"/>
+      <w:r>
+        <w:t>yaad</w:t>
+      </w:r>
+      <w:proofErr w:type="spellEnd"/>
+      <w:r>
+        <w:t xml:space="preserve"> </w:t>
+      </w:r>
+      <w:proofErr w:type="spellStart"/>
+      <w:r>
+        <w:t>rakhna</w:t>
+      </w:r>
+      <w:proofErr w:type="spellEnd"/>
+      <w:r>
+        <w:t xml:space="preserve">, C++ </w:t>
+      </w:r>
+      <w:proofErr w:type="spellStart"/>
+      <w:r>
+        <w:t>mein</w:t>
+      </w:r>
+      <w:proofErr w:type="spellEnd"/>
+      <w:r>
+        <w:t xml:space="preserve"> Capital Letter aur Small Letter ka </w:t>
+      </w:r>
+      <w:proofErr w:type="spellStart"/>
+      <w:r>
+        <w:t>matlab</w:t>
+      </w:r>
+      <w:proofErr w:type="spellEnd"/>
+      <w:r>
+        <w:t xml:space="preserve"> </w:t>
+      </w:r>
+      <w:proofErr w:type="spellStart"/>
+      <w:r>
+        <w:t>alag</w:t>
+      </w:r>
+      <w:proofErr w:type="spellEnd"/>
+      <w:r>
+        <w:t xml:space="preserve"> </w:t>
+      </w:r>
+      <w:proofErr w:type="spellStart"/>
+      <w:r>
+        <w:t>hota</w:t>
+      </w:r>
+      <w:proofErr w:type="spellEnd"/>
+      <w:r>
+        <w:t xml:space="preserve"> </w:t>
+      </w:r>
+      <w:proofErr w:type="spellStart"/>
+      <w:r>
+        <w:t>hai</w:t>
+      </w:r>
+      <w:proofErr w:type="spellEnd"/>
+      <w:r>
+        <w:t>.</w:t>
+      </w:r>
+    </w:p>
+    <w:p>
+      <w:pPr>
+        <w:numPr>
+          <w:ilvl w:val="0"/>
+          <w:numId w:val="10"/>
+        </w:numPr>
+      </w:pPr>
+      <w:r>
+        <w:t xml:space="preserve">int marks; aur int Marks; C++ </w:t>
+      </w:r>
+      <w:proofErr w:type="spellStart"/>
+      <w:r>
+        <w:t>ke</w:t>
+      </w:r>
+      <w:proofErr w:type="spellEnd"/>
+      <w:r>
+        <w:t xml:space="preserve"> </w:t>
+      </w:r>
+      <w:proofErr w:type="spellStart"/>
+      <w:r>
+        <w:t>liye</w:t>
+      </w:r>
+      <w:proofErr w:type="spellEnd"/>
+      <w:r>
+        <w:t xml:space="preserve"> do </w:t>
+      </w:r>
+      <w:proofErr w:type="spellStart"/>
+      <w:r>
+        <w:t>alag-alag</w:t>
+      </w:r>
+      <w:proofErr w:type="spellEnd"/>
+      <w:r>
+        <w:t xml:space="preserve"> variables hain.</w:t>
+      </w:r>
+    </w:p>
+    <w:p>
+      <w:pPr>
+        <w:numPr>
+          <w:ilvl w:val="0"/>
+          <w:numId w:val="10"/>
+        </w:numPr>
+      </w:pPr>
+      <w:r>
+        <w:lastRenderedPageBreak/>
+        <w:t xml:space="preserve">Aksar </w:t>
+      </w:r>
+      <w:proofErr w:type="spellStart"/>
+      <w:r>
+        <w:t>naye</w:t>
+      </w:r>
+      <w:proofErr w:type="spellEnd"/>
+      <w:r>
+        <w:t xml:space="preserve"> coders </w:t>
+      </w:r>
+      <w:proofErr w:type="gramStart"/>
+      <w:r>
+        <w:t>Main(</w:t>
+      </w:r>
+      <w:proofErr w:type="gramEnd"/>
+      <w:r>
+        <w:t xml:space="preserve">) </w:t>
+      </w:r>
+      <w:proofErr w:type="spellStart"/>
+      <w:r>
+        <w:t>likh</w:t>
+      </w:r>
+      <w:proofErr w:type="spellEnd"/>
+      <w:r>
+        <w:t xml:space="preserve"> </w:t>
+      </w:r>
+      <w:proofErr w:type="spellStart"/>
+      <w:r>
+        <w:t>dete</w:t>
+      </w:r>
+      <w:proofErr w:type="spellEnd"/>
+      <w:r>
+        <w:t xml:space="preserve"> hain </w:t>
+      </w:r>
+      <w:proofErr w:type="spellStart"/>
+      <w:r>
+        <w:t>jabki</w:t>
+      </w:r>
+      <w:proofErr w:type="spellEnd"/>
+      <w:r>
+        <w:t xml:space="preserve"> C++ </w:t>
+      </w:r>
+      <w:proofErr w:type="spellStart"/>
+      <w:r>
+        <w:t>sirf</w:t>
+      </w:r>
+      <w:proofErr w:type="spellEnd"/>
+      <w:r>
+        <w:t xml:space="preserve"> </w:t>
+      </w:r>
+      <w:proofErr w:type="gramStart"/>
+      <w:r>
+        <w:t>main(</w:t>
+      </w:r>
+      <w:proofErr w:type="gramEnd"/>
+      <w:r>
+        <w:t xml:space="preserve">) ko starting point </w:t>
+      </w:r>
+      <w:proofErr w:type="spellStart"/>
+      <w:r>
+        <w:t>samajhta</w:t>
+      </w:r>
+      <w:proofErr w:type="spellEnd"/>
+      <w:r>
+        <w:t xml:space="preserve"> </w:t>
+      </w:r>
+      <w:proofErr w:type="spellStart"/>
+      <w:r>
+        <w:t>hai</w:t>
+      </w:r>
+      <w:proofErr w:type="spellEnd"/>
+      <w:r>
+        <w:t>.</w:t>
+      </w:r>
+    </w:p>
+    <w:p>
+      <w:r>
+        <w:pict w14:anchorId="314DD34D">
+          <v:rect id="_x0000_i1057" style="width:0;height:1.5pt" o:hralign="center" o:hrstd="t" o:hr="t" fillcolor="#a0a0a0" stroked="f"/>
+        </w:pict>
       </w:r>
     </w:p>
     <w:p/>
@@ -32,6 +1980,1459 @@
     </w:sectPr>
   </w:body>
 </w:document>
+</file>
+
+<file path=word/numbering.xml><?xml version="1.0" encoding="utf-8"?>
+<w:numbering xmlns:wpc="http://schemas.microsoft.com/office/word/2010/wordprocessingCanvas" xmlns:cx="http://schemas.microsoft.com/office/drawing/2014/chartex" xmlns:cx1="http://schemas.microsoft.com/office/drawing/2015/9/8/chartex" xmlns:cx2="http://schemas.microsoft.com/office/drawing/2015/10/21/chartex" xmlns:cx3="http://schemas.microsoft.com/office/drawing/2016/5/9/chartex" xmlns:cx4="http://schemas.microsoft.com/office/drawing/2016/5/10/chartex" xmlns:cx5="http://schemas.microsoft.com/office/drawing/2016/5/11/chartex" xmlns:cx6="http://schemas.microsoft.com/office/drawing/2016/5/12/chartex" xmlns:cx7="http://schemas.microsoft.com/office/drawing/2016/5/13/chartex" xmlns:cx8="http://schemas.microsoft.com/office/drawing/2016/5/14/chartex" xmlns:mc="http://schemas.openxmlformats.org/markup-compatibility/2006" xmlns:aink="http://schemas.microsoft.com/office/drawing/2016/ink" xmlns:am3d="http://schemas.microsoft.com/office/drawing/2017/model3d" xmlns:o="urn:schemas-microsoft-com:office:office" xmlns:oel="http://schemas.microsoft.com/office/2019/extlst" xmlns:r="http://schemas.openxmlformats.org/officeDocument/2006/relationships" xmlns:m="http://schemas.openxmlformats.org/officeDocument/2006/math" xmlns:v="urn:schemas-microsoft-com:vml" xmlns:wp14="http://schemas.microsoft.com/office/word/2010/wordprocessingDrawing" xmlns:wp="http://schemas.openxmlformats.org/drawingml/2006/wordprocessingDrawing" xmlns:w10="urn:schemas-microsoft-com:office:word" xmlns:w="http://schemas.openxmlformats.org/wordprocessingml/2006/main" xmlns:w14="http://schemas.microsoft.com/office/word/2010/wordml" xmlns:w15="http://schemas.microsoft.com/office/word/2012/wordml" xmlns:w16cex="http://schemas.microsoft.com/office/word/2018/wordml/cex" xmlns:w16cid="http://schemas.microsoft.com/office/word/2016/wordml/cid" xmlns:w16="http://schemas.microsoft.com/office/word/2018/wordml" xmlns:w16du="http://schemas.microsoft.com/office/word/2023/wordml/word16du" xmlns:w16sdtdh="http://schemas.microsoft.com/office/word/2020/wordml/sdtdatahash" xmlns:w16sdtfl="http://schemas.microsoft.com/office/word/2024/wordml/sdtformatlock" xmlns:w16se="http://schemas.microsoft.com/office/word/2015/wordml/symex" xmlns:wpg="http://schemas.microsoft.com/office/word/2010/wordprocessingGroup" xmlns:wpi="http://schemas.microsoft.com/office/word/2010/wordprocessingInk" xmlns:wne="http://schemas.microsoft.com/office/word/2006/wordml" xmlns:wps="http://schemas.microsoft.com/office/word/2010/wordprocessingShape" mc:Ignorable="w14 w15 w16se w16cid w16 w16cex w16sdtdh w16sdtfl w16du wp14">
+  <w:abstractNum w:abstractNumId="0" w15:restartNumberingAfterBreak="0">
+    <w:nsid w:val="097C1168"/>
+    <w:multiLevelType w:val="multilevel"/>
+    <w:tmpl w:val="D2E63EC6"/>
+    <w:lvl w:ilvl="0">
+      <w:start w:val="1"/>
+      <w:numFmt w:val="bullet"/>
+      <w:lvlText w:val=""/>
+      <w:lvlJc w:val="left"/>
+      <w:pPr>
+        <w:tabs>
+          <w:tab w:val="num" w:pos="720"/>
+        </w:tabs>
+        <w:ind w:left="720" w:hanging="360"/>
+      </w:pPr>
+      <w:rPr>
+        <w:rFonts w:ascii="Symbol" w:hAnsi="Symbol" w:hint="default"/>
+        <w:sz w:val="20"/>
+      </w:rPr>
+    </w:lvl>
+    <w:lvl w:ilvl="1" w:tentative="1">
+      <w:start w:val="1"/>
+      <w:numFmt w:val="bullet"/>
+      <w:lvlText w:val="o"/>
+      <w:lvlJc w:val="left"/>
+      <w:pPr>
+        <w:tabs>
+          <w:tab w:val="num" w:pos="1440"/>
+        </w:tabs>
+        <w:ind w:left="1440" w:hanging="360"/>
+      </w:pPr>
+      <w:rPr>
+        <w:rFonts w:ascii="Courier New" w:hAnsi="Courier New" w:hint="default"/>
+        <w:sz w:val="20"/>
+      </w:rPr>
+    </w:lvl>
+    <w:lvl w:ilvl="2" w:tentative="1">
+      <w:start w:val="1"/>
+      <w:numFmt w:val="bullet"/>
+      <w:lvlText w:val=""/>
+      <w:lvlJc w:val="left"/>
+      <w:pPr>
+        <w:tabs>
+          <w:tab w:val="num" w:pos="2160"/>
+        </w:tabs>
+        <w:ind w:left="2160" w:hanging="360"/>
+      </w:pPr>
+      <w:rPr>
+        <w:rFonts w:ascii="Wingdings" w:hAnsi="Wingdings" w:hint="default"/>
+        <w:sz w:val="20"/>
+      </w:rPr>
+    </w:lvl>
+    <w:lvl w:ilvl="3" w:tentative="1">
+      <w:start w:val="1"/>
+      <w:numFmt w:val="bullet"/>
+      <w:lvlText w:val=""/>
+      <w:lvlJc w:val="left"/>
+      <w:pPr>
+        <w:tabs>
+          <w:tab w:val="num" w:pos="2880"/>
+        </w:tabs>
+        <w:ind w:left="2880" w:hanging="360"/>
+      </w:pPr>
+      <w:rPr>
+        <w:rFonts w:ascii="Wingdings" w:hAnsi="Wingdings" w:hint="default"/>
+        <w:sz w:val="20"/>
+      </w:rPr>
+    </w:lvl>
+    <w:lvl w:ilvl="4" w:tentative="1">
+      <w:start w:val="1"/>
+      <w:numFmt w:val="bullet"/>
+      <w:lvlText w:val=""/>
+      <w:lvlJc w:val="left"/>
+      <w:pPr>
+        <w:tabs>
+          <w:tab w:val="num" w:pos="3600"/>
+        </w:tabs>
+        <w:ind w:left="3600" w:hanging="360"/>
+      </w:pPr>
+      <w:rPr>
+        <w:rFonts w:ascii="Wingdings" w:hAnsi="Wingdings" w:hint="default"/>
+        <w:sz w:val="20"/>
+      </w:rPr>
+    </w:lvl>
+    <w:lvl w:ilvl="5" w:tentative="1">
+      <w:start w:val="1"/>
+      <w:numFmt w:val="bullet"/>
+      <w:lvlText w:val=""/>
+      <w:lvlJc w:val="left"/>
+      <w:pPr>
+        <w:tabs>
+          <w:tab w:val="num" w:pos="4320"/>
+        </w:tabs>
+        <w:ind w:left="4320" w:hanging="360"/>
+      </w:pPr>
+      <w:rPr>
+        <w:rFonts w:ascii="Wingdings" w:hAnsi="Wingdings" w:hint="default"/>
+        <w:sz w:val="20"/>
+      </w:rPr>
+    </w:lvl>
+    <w:lvl w:ilvl="6" w:tentative="1">
+      <w:start w:val="1"/>
+      <w:numFmt w:val="bullet"/>
+      <w:lvlText w:val=""/>
+      <w:lvlJc w:val="left"/>
+      <w:pPr>
+        <w:tabs>
+          <w:tab w:val="num" w:pos="5040"/>
+        </w:tabs>
+        <w:ind w:left="5040" w:hanging="360"/>
+      </w:pPr>
+      <w:rPr>
+        <w:rFonts w:ascii="Wingdings" w:hAnsi="Wingdings" w:hint="default"/>
+        <w:sz w:val="20"/>
+      </w:rPr>
+    </w:lvl>
+    <w:lvl w:ilvl="7" w:tentative="1">
+      <w:start w:val="1"/>
+      <w:numFmt w:val="bullet"/>
+      <w:lvlText w:val=""/>
+      <w:lvlJc w:val="left"/>
+      <w:pPr>
+        <w:tabs>
+          <w:tab w:val="num" w:pos="5760"/>
+        </w:tabs>
+        <w:ind w:left="5760" w:hanging="360"/>
+      </w:pPr>
+      <w:rPr>
+        <w:rFonts w:ascii="Wingdings" w:hAnsi="Wingdings" w:hint="default"/>
+        <w:sz w:val="20"/>
+      </w:rPr>
+    </w:lvl>
+    <w:lvl w:ilvl="8" w:tentative="1">
+      <w:start w:val="1"/>
+      <w:numFmt w:val="bullet"/>
+      <w:lvlText w:val=""/>
+      <w:lvlJc w:val="left"/>
+      <w:pPr>
+        <w:tabs>
+          <w:tab w:val="num" w:pos="6480"/>
+        </w:tabs>
+        <w:ind w:left="6480" w:hanging="360"/>
+      </w:pPr>
+      <w:rPr>
+        <w:rFonts w:ascii="Wingdings" w:hAnsi="Wingdings" w:hint="default"/>
+        <w:sz w:val="20"/>
+      </w:rPr>
+    </w:lvl>
+  </w:abstractNum>
+  <w:abstractNum w:abstractNumId="1" w15:restartNumberingAfterBreak="0">
+    <w:nsid w:val="0C485678"/>
+    <w:multiLevelType w:val="multilevel"/>
+    <w:tmpl w:val="0F7C757C"/>
+    <w:lvl w:ilvl="0">
+      <w:start w:val="1"/>
+      <w:numFmt w:val="bullet"/>
+      <w:lvlText w:val=""/>
+      <w:lvlJc w:val="left"/>
+      <w:pPr>
+        <w:tabs>
+          <w:tab w:val="num" w:pos="720"/>
+        </w:tabs>
+        <w:ind w:left="720" w:hanging="360"/>
+      </w:pPr>
+      <w:rPr>
+        <w:rFonts w:ascii="Symbol" w:hAnsi="Symbol" w:hint="default"/>
+        <w:sz w:val="20"/>
+      </w:rPr>
+    </w:lvl>
+    <w:lvl w:ilvl="1" w:tentative="1">
+      <w:start w:val="1"/>
+      <w:numFmt w:val="bullet"/>
+      <w:lvlText w:val="o"/>
+      <w:lvlJc w:val="left"/>
+      <w:pPr>
+        <w:tabs>
+          <w:tab w:val="num" w:pos="1440"/>
+        </w:tabs>
+        <w:ind w:left="1440" w:hanging="360"/>
+      </w:pPr>
+      <w:rPr>
+        <w:rFonts w:ascii="Courier New" w:hAnsi="Courier New" w:hint="default"/>
+        <w:sz w:val="20"/>
+      </w:rPr>
+    </w:lvl>
+    <w:lvl w:ilvl="2" w:tentative="1">
+      <w:start w:val="1"/>
+      <w:numFmt w:val="bullet"/>
+      <w:lvlText w:val=""/>
+      <w:lvlJc w:val="left"/>
+      <w:pPr>
+        <w:tabs>
+          <w:tab w:val="num" w:pos="2160"/>
+        </w:tabs>
+        <w:ind w:left="2160" w:hanging="360"/>
+      </w:pPr>
+      <w:rPr>
+        <w:rFonts w:ascii="Wingdings" w:hAnsi="Wingdings" w:hint="default"/>
+        <w:sz w:val="20"/>
+      </w:rPr>
+    </w:lvl>
+    <w:lvl w:ilvl="3" w:tentative="1">
+      <w:start w:val="1"/>
+      <w:numFmt w:val="bullet"/>
+      <w:lvlText w:val=""/>
+      <w:lvlJc w:val="left"/>
+      <w:pPr>
+        <w:tabs>
+          <w:tab w:val="num" w:pos="2880"/>
+        </w:tabs>
+        <w:ind w:left="2880" w:hanging="360"/>
+      </w:pPr>
+      <w:rPr>
+        <w:rFonts w:ascii="Wingdings" w:hAnsi="Wingdings" w:hint="default"/>
+        <w:sz w:val="20"/>
+      </w:rPr>
+    </w:lvl>
+    <w:lvl w:ilvl="4" w:tentative="1">
+      <w:start w:val="1"/>
+      <w:numFmt w:val="bullet"/>
+      <w:lvlText w:val=""/>
+      <w:lvlJc w:val="left"/>
+      <w:pPr>
+        <w:tabs>
+          <w:tab w:val="num" w:pos="3600"/>
+        </w:tabs>
+        <w:ind w:left="3600" w:hanging="360"/>
+      </w:pPr>
+      <w:rPr>
+        <w:rFonts w:ascii="Wingdings" w:hAnsi="Wingdings" w:hint="default"/>
+        <w:sz w:val="20"/>
+      </w:rPr>
+    </w:lvl>
+    <w:lvl w:ilvl="5" w:tentative="1">
+      <w:start w:val="1"/>
+      <w:numFmt w:val="bullet"/>
+      <w:lvlText w:val=""/>
+      <w:lvlJc w:val="left"/>
+      <w:pPr>
+        <w:tabs>
+          <w:tab w:val="num" w:pos="4320"/>
+        </w:tabs>
+        <w:ind w:left="4320" w:hanging="360"/>
+      </w:pPr>
+      <w:rPr>
+        <w:rFonts w:ascii="Wingdings" w:hAnsi="Wingdings" w:hint="default"/>
+        <w:sz w:val="20"/>
+      </w:rPr>
+    </w:lvl>
+    <w:lvl w:ilvl="6" w:tentative="1">
+      <w:start w:val="1"/>
+      <w:numFmt w:val="bullet"/>
+      <w:lvlText w:val=""/>
+      <w:lvlJc w:val="left"/>
+      <w:pPr>
+        <w:tabs>
+          <w:tab w:val="num" w:pos="5040"/>
+        </w:tabs>
+        <w:ind w:left="5040" w:hanging="360"/>
+      </w:pPr>
+      <w:rPr>
+        <w:rFonts w:ascii="Wingdings" w:hAnsi="Wingdings" w:hint="default"/>
+        <w:sz w:val="20"/>
+      </w:rPr>
+    </w:lvl>
+    <w:lvl w:ilvl="7" w:tentative="1">
+      <w:start w:val="1"/>
+      <w:numFmt w:val="bullet"/>
+      <w:lvlText w:val=""/>
+      <w:lvlJc w:val="left"/>
+      <w:pPr>
+        <w:tabs>
+          <w:tab w:val="num" w:pos="5760"/>
+        </w:tabs>
+        <w:ind w:left="5760" w:hanging="360"/>
+      </w:pPr>
+      <w:rPr>
+        <w:rFonts w:ascii="Wingdings" w:hAnsi="Wingdings" w:hint="default"/>
+        <w:sz w:val="20"/>
+      </w:rPr>
+    </w:lvl>
+    <w:lvl w:ilvl="8" w:tentative="1">
+      <w:start w:val="1"/>
+      <w:numFmt w:val="bullet"/>
+      <w:lvlText w:val=""/>
+      <w:lvlJc w:val="left"/>
+      <w:pPr>
+        <w:tabs>
+          <w:tab w:val="num" w:pos="6480"/>
+        </w:tabs>
+        <w:ind w:left="6480" w:hanging="360"/>
+      </w:pPr>
+      <w:rPr>
+        <w:rFonts w:ascii="Wingdings" w:hAnsi="Wingdings" w:hint="default"/>
+        <w:sz w:val="20"/>
+      </w:rPr>
+    </w:lvl>
+  </w:abstractNum>
+  <w:abstractNum w:abstractNumId="2" w15:restartNumberingAfterBreak="0">
+    <w:nsid w:val="14A523DC"/>
+    <w:multiLevelType w:val="multilevel"/>
+    <w:tmpl w:val="EAECFA80"/>
+    <w:lvl w:ilvl="0">
+      <w:start w:val="1"/>
+      <w:numFmt w:val="bullet"/>
+      <w:lvlText w:val=""/>
+      <w:lvlJc w:val="left"/>
+      <w:pPr>
+        <w:tabs>
+          <w:tab w:val="num" w:pos="720"/>
+        </w:tabs>
+        <w:ind w:left="720" w:hanging="360"/>
+      </w:pPr>
+      <w:rPr>
+        <w:rFonts w:ascii="Symbol" w:hAnsi="Symbol" w:hint="default"/>
+        <w:sz w:val="20"/>
+      </w:rPr>
+    </w:lvl>
+    <w:lvl w:ilvl="1" w:tentative="1">
+      <w:start w:val="1"/>
+      <w:numFmt w:val="bullet"/>
+      <w:lvlText w:val="o"/>
+      <w:lvlJc w:val="left"/>
+      <w:pPr>
+        <w:tabs>
+          <w:tab w:val="num" w:pos="1440"/>
+        </w:tabs>
+        <w:ind w:left="1440" w:hanging="360"/>
+      </w:pPr>
+      <w:rPr>
+        <w:rFonts w:ascii="Courier New" w:hAnsi="Courier New" w:hint="default"/>
+        <w:sz w:val="20"/>
+      </w:rPr>
+    </w:lvl>
+    <w:lvl w:ilvl="2" w:tentative="1">
+      <w:start w:val="1"/>
+      <w:numFmt w:val="bullet"/>
+      <w:lvlText w:val=""/>
+      <w:lvlJc w:val="left"/>
+      <w:pPr>
+        <w:tabs>
+          <w:tab w:val="num" w:pos="2160"/>
+        </w:tabs>
+        <w:ind w:left="2160" w:hanging="360"/>
+      </w:pPr>
+      <w:rPr>
+        <w:rFonts w:ascii="Wingdings" w:hAnsi="Wingdings" w:hint="default"/>
+        <w:sz w:val="20"/>
+      </w:rPr>
+    </w:lvl>
+    <w:lvl w:ilvl="3" w:tentative="1">
+      <w:start w:val="1"/>
+      <w:numFmt w:val="bullet"/>
+      <w:lvlText w:val=""/>
+      <w:lvlJc w:val="left"/>
+      <w:pPr>
+        <w:tabs>
+          <w:tab w:val="num" w:pos="2880"/>
+        </w:tabs>
+        <w:ind w:left="2880" w:hanging="360"/>
+      </w:pPr>
+      <w:rPr>
+        <w:rFonts w:ascii="Wingdings" w:hAnsi="Wingdings" w:hint="default"/>
+        <w:sz w:val="20"/>
+      </w:rPr>
+    </w:lvl>
+    <w:lvl w:ilvl="4" w:tentative="1">
+      <w:start w:val="1"/>
+      <w:numFmt w:val="bullet"/>
+      <w:lvlText w:val=""/>
+      <w:lvlJc w:val="left"/>
+      <w:pPr>
+        <w:tabs>
+          <w:tab w:val="num" w:pos="3600"/>
+        </w:tabs>
+        <w:ind w:left="3600" w:hanging="360"/>
+      </w:pPr>
+      <w:rPr>
+        <w:rFonts w:ascii="Wingdings" w:hAnsi="Wingdings" w:hint="default"/>
+        <w:sz w:val="20"/>
+      </w:rPr>
+    </w:lvl>
+    <w:lvl w:ilvl="5" w:tentative="1">
+      <w:start w:val="1"/>
+      <w:numFmt w:val="bullet"/>
+      <w:lvlText w:val=""/>
+      <w:lvlJc w:val="left"/>
+      <w:pPr>
+        <w:tabs>
+          <w:tab w:val="num" w:pos="4320"/>
+        </w:tabs>
+        <w:ind w:left="4320" w:hanging="360"/>
+      </w:pPr>
+      <w:rPr>
+        <w:rFonts w:ascii="Wingdings" w:hAnsi="Wingdings" w:hint="default"/>
+        <w:sz w:val="20"/>
+      </w:rPr>
+    </w:lvl>
+    <w:lvl w:ilvl="6" w:tentative="1">
+      <w:start w:val="1"/>
+      <w:numFmt w:val="bullet"/>
+      <w:lvlText w:val=""/>
+      <w:lvlJc w:val="left"/>
+      <w:pPr>
+        <w:tabs>
+          <w:tab w:val="num" w:pos="5040"/>
+        </w:tabs>
+        <w:ind w:left="5040" w:hanging="360"/>
+      </w:pPr>
+      <w:rPr>
+        <w:rFonts w:ascii="Wingdings" w:hAnsi="Wingdings" w:hint="default"/>
+        <w:sz w:val="20"/>
+      </w:rPr>
+    </w:lvl>
+    <w:lvl w:ilvl="7" w:tentative="1">
+      <w:start w:val="1"/>
+      <w:numFmt w:val="bullet"/>
+      <w:lvlText w:val=""/>
+      <w:lvlJc w:val="left"/>
+      <w:pPr>
+        <w:tabs>
+          <w:tab w:val="num" w:pos="5760"/>
+        </w:tabs>
+        <w:ind w:left="5760" w:hanging="360"/>
+      </w:pPr>
+      <w:rPr>
+        <w:rFonts w:ascii="Wingdings" w:hAnsi="Wingdings" w:hint="default"/>
+        <w:sz w:val="20"/>
+      </w:rPr>
+    </w:lvl>
+    <w:lvl w:ilvl="8" w:tentative="1">
+      <w:start w:val="1"/>
+      <w:numFmt w:val="bullet"/>
+      <w:lvlText w:val=""/>
+      <w:lvlJc w:val="left"/>
+      <w:pPr>
+        <w:tabs>
+          <w:tab w:val="num" w:pos="6480"/>
+        </w:tabs>
+        <w:ind w:left="6480" w:hanging="360"/>
+      </w:pPr>
+      <w:rPr>
+        <w:rFonts w:ascii="Wingdings" w:hAnsi="Wingdings" w:hint="default"/>
+        <w:sz w:val="20"/>
+      </w:rPr>
+    </w:lvl>
+  </w:abstractNum>
+  <w:abstractNum w:abstractNumId="3" w15:restartNumberingAfterBreak="0">
+    <w:nsid w:val="1BDF7B32"/>
+    <w:multiLevelType w:val="multilevel"/>
+    <w:tmpl w:val="EF8C8248"/>
+    <w:lvl w:ilvl="0">
+      <w:start w:val="1"/>
+      <w:numFmt w:val="decimal"/>
+      <w:lvlText w:val="%1."/>
+      <w:lvlJc w:val="left"/>
+      <w:pPr>
+        <w:tabs>
+          <w:tab w:val="num" w:pos="720"/>
+        </w:tabs>
+        <w:ind w:left="720" w:hanging="360"/>
+      </w:pPr>
+    </w:lvl>
+    <w:lvl w:ilvl="1" w:tentative="1">
+      <w:start w:val="1"/>
+      <w:numFmt w:val="decimal"/>
+      <w:lvlText w:val="%2."/>
+      <w:lvlJc w:val="left"/>
+      <w:pPr>
+        <w:tabs>
+          <w:tab w:val="num" w:pos="1440"/>
+        </w:tabs>
+        <w:ind w:left="1440" w:hanging="360"/>
+      </w:pPr>
+    </w:lvl>
+    <w:lvl w:ilvl="2" w:tentative="1">
+      <w:start w:val="1"/>
+      <w:numFmt w:val="decimal"/>
+      <w:lvlText w:val="%3."/>
+      <w:lvlJc w:val="left"/>
+      <w:pPr>
+        <w:tabs>
+          <w:tab w:val="num" w:pos="2160"/>
+        </w:tabs>
+        <w:ind w:left="2160" w:hanging="360"/>
+      </w:pPr>
+    </w:lvl>
+    <w:lvl w:ilvl="3" w:tentative="1">
+      <w:start w:val="1"/>
+      <w:numFmt w:val="decimal"/>
+      <w:lvlText w:val="%4."/>
+      <w:lvlJc w:val="left"/>
+      <w:pPr>
+        <w:tabs>
+          <w:tab w:val="num" w:pos="2880"/>
+        </w:tabs>
+        <w:ind w:left="2880" w:hanging="360"/>
+      </w:pPr>
+    </w:lvl>
+    <w:lvl w:ilvl="4" w:tentative="1">
+      <w:start w:val="1"/>
+      <w:numFmt w:val="decimal"/>
+      <w:lvlText w:val="%5."/>
+      <w:lvlJc w:val="left"/>
+      <w:pPr>
+        <w:tabs>
+          <w:tab w:val="num" w:pos="3600"/>
+        </w:tabs>
+        <w:ind w:left="3600" w:hanging="360"/>
+      </w:pPr>
+    </w:lvl>
+    <w:lvl w:ilvl="5" w:tentative="1">
+      <w:start w:val="1"/>
+      <w:numFmt w:val="decimal"/>
+      <w:lvlText w:val="%6."/>
+      <w:lvlJc w:val="left"/>
+      <w:pPr>
+        <w:tabs>
+          <w:tab w:val="num" w:pos="4320"/>
+        </w:tabs>
+        <w:ind w:left="4320" w:hanging="360"/>
+      </w:pPr>
+    </w:lvl>
+    <w:lvl w:ilvl="6" w:tentative="1">
+      <w:start w:val="1"/>
+      <w:numFmt w:val="decimal"/>
+      <w:lvlText w:val="%7."/>
+      <w:lvlJc w:val="left"/>
+      <w:pPr>
+        <w:tabs>
+          <w:tab w:val="num" w:pos="5040"/>
+        </w:tabs>
+        <w:ind w:left="5040" w:hanging="360"/>
+      </w:pPr>
+    </w:lvl>
+    <w:lvl w:ilvl="7" w:tentative="1">
+      <w:start w:val="1"/>
+      <w:numFmt w:val="decimal"/>
+      <w:lvlText w:val="%8."/>
+      <w:lvlJc w:val="left"/>
+      <w:pPr>
+        <w:tabs>
+          <w:tab w:val="num" w:pos="5760"/>
+        </w:tabs>
+        <w:ind w:left="5760" w:hanging="360"/>
+      </w:pPr>
+    </w:lvl>
+    <w:lvl w:ilvl="8" w:tentative="1">
+      <w:start w:val="1"/>
+      <w:numFmt w:val="decimal"/>
+      <w:lvlText w:val="%9."/>
+      <w:lvlJc w:val="left"/>
+      <w:pPr>
+        <w:tabs>
+          <w:tab w:val="num" w:pos="6480"/>
+        </w:tabs>
+        <w:ind w:left="6480" w:hanging="360"/>
+      </w:pPr>
+    </w:lvl>
+  </w:abstractNum>
+  <w:abstractNum w:abstractNumId="4" w15:restartNumberingAfterBreak="0">
+    <w:nsid w:val="43A013B6"/>
+    <w:multiLevelType w:val="multilevel"/>
+    <w:tmpl w:val="B7E8E2A0"/>
+    <w:lvl w:ilvl="0">
+      <w:start w:val="1"/>
+      <w:numFmt w:val="bullet"/>
+      <w:lvlText w:val=""/>
+      <w:lvlJc w:val="left"/>
+      <w:pPr>
+        <w:tabs>
+          <w:tab w:val="num" w:pos="720"/>
+        </w:tabs>
+        <w:ind w:left="720" w:hanging="360"/>
+      </w:pPr>
+      <w:rPr>
+        <w:rFonts w:ascii="Symbol" w:hAnsi="Symbol" w:hint="default"/>
+        <w:sz w:val="20"/>
+      </w:rPr>
+    </w:lvl>
+    <w:lvl w:ilvl="1" w:tentative="1">
+      <w:start w:val="1"/>
+      <w:numFmt w:val="bullet"/>
+      <w:lvlText w:val="o"/>
+      <w:lvlJc w:val="left"/>
+      <w:pPr>
+        <w:tabs>
+          <w:tab w:val="num" w:pos="1440"/>
+        </w:tabs>
+        <w:ind w:left="1440" w:hanging="360"/>
+      </w:pPr>
+      <w:rPr>
+        <w:rFonts w:ascii="Courier New" w:hAnsi="Courier New" w:hint="default"/>
+        <w:sz w:val="20"/>
+      </w:rPr>
+    </w:lvl>
+    <w:lvl w:ilvl="2" w:tentative="1">
+      <w:start w:val="1"/>
+      <w:numFmt w:val="bullet"/>
+      <w:lvlText w:val=""/>
+      <w:lvlJc w:val="left"/>
+      <w:pPr>
+        <w:tabs>
+          <w:tab w:val="num" w:pos="2160"/>
+        </w:tabs>
+        <w:ind w:left="2160" w:hanging="360"/>
+      </w:pPr>
+      <w:rPr>
+        <w:rFonts w:ascii="Wingdings" w:hAnsi="Wingdings" w:hint="default"/>
+        <w:sz w:val="20"/>
+      </w:rPr>
+    </w:lvl>
+    <w:lvl w:ilvl="3" w:tentative="1">
+      <w:start w:val="1"/>
+      <w:numFmt w:val="bullet"/>
+      <w:lvlText w:val=""/>
+      <w:lvlJc w:val="left"/>
+      <w:pPr>
+        <w:tabs>
+          <w:tab w:val="num" w:pos="2880"/>
+        </w:tabs>
+        <w:ind w:left="2880" w:hanging="360"/>
+      </w:pPr>
+      <w:rPr>
+        <w:rFonts w:ascii="Wingdings" w:hAnsi="Wingdings" w:hint="default"/>
+        <w:sz w:val="20"/>
+      </w:rPr>
+    </w:lvl>
+    <w:lvl w:ilvl="4" w:tentative="1">
+      <w:start w:val="1"/>
+      <w:numFmt w:val="bullet"/>
+      <w:lvlText w:val=""/>
+      <w:lvlJc w:val="left"/>
+      <w:pPr>
+        <w:tabs>
+          <w:tab w:val="num" w:pos="3600"/>
+        </w:tabs>
+        <w:ind w:left="3600" w:hanging="360"/>
+      </w:pPr>
+      <w:rPr>
+        <w:rFonts w:ascii="Wingdings" w:hAnsi="Wingdings" w:hint="default"/>
+        <w:sz w:val="20"/>
+      </w:rPr>
+    </w:lvl>
+    <w:lvl w:ilvl="5" w:tentative="1">
+      <w:start w:val="1"/>
+      <w:numFmt w:val="bullet"/>
+      <w:lvlText w:val=""/>
+      <w:lvlJc w:val="left"/>
+      <w:pPr>
+        <w:tabs>
+          <w:tab w:val="num" w:pos="4320"/>
+        </w:tabs>
+        <w:ind w:left="4320" w:hanging="360"/>
+      </w:pPr>
+      <w:rPr>
+        <w:rFonts w:ascii="Wingdings" w:hAnsi="Wingdings" w:hint="default"/>
+        <w:sz w:val="20"/>
+      </w:rPr>
+    </w:lvl>
+    <w:lvl w:ilvl="6" w:tentative="1">
+      <w:start w:val="1"/>
+      <w:numFmt w:val="bullet"/>
+      <w:lvlText w:val=""/>
+      <w:lvlJc w:val="left"/>
+      <w:pPr>
+        <w:tabs>
+          <w:tab w:val="num" w:pos="5040"/>
+        </w:tabs>
+        <w:ind w:left="5040" w:hanging="360"/>
+      </w:pPr>
+      <w:rPr>
+        <w:rFonts w:ascii="Wingdings" w:hAnsi="Wingdings" w:hint="default"/>
+        <w:sz w:val="20"/>
+      </w:rPr>
+    </w:lvl>
+    <w:lvl w:ilvl="7" w:tentative="1">
+      <w:start w:val="1"/>
+      <w:numFmt w:val="bullet"/>
+      <w:lvlText w:val=""/>
+      <w:lvlJc w:val="left"/>
+      <w:pPr>
+        <w:tabs>
+          <w:tab w:val="num" w:pos="5760"/>
+        </w:tabs>
+        <w:ind w:left="5760" w:hanging="360"/>
+      </w:pPr>
+      <w:rPr>
+        <w:rFonts w:ascii="Wingdings" w:hAnsi="Wingdings" w:hint="default"/>
+        <w:sz w:val="20"/>
+      </w:rPr>
+    </w:lvl>
+    <w:lvl w:ilvl="8" w:tentative="1">
+      <w:start w:val="1"/>
+      <w:numFmt w:val="bullet"/>
+      <w:lvlText w:val=""/>
+      <w:lvlJc w:val="left"/>
+      <w:pPr>
+        <w:tabs>
+          <w:tab w:val="num" w:pos="6480"/>
+        </w:tabs>
+        <w:ind w:left="6480" w:hanging="360"/>
+      </w:pPr>
+      <w:rPr>
+        <w:rFonts w:ascii="Wingdings" w:hAnsi="Wingdings" w:hint="default"/>
+        <w:sz w:val="20"/>
+      </w:rPr>
+    </w:lvl>
+  </w:abstractNum>
+  <w:abstractNum w:abstractNumId="5" w15:restartNumberingAfterBreak="0">
+    <w:nsid w:val="450E68A2"/>
+    <w:multiLevelType w:val="multilevel"/>
+    <w:tmpl w:val="DAFEDE30"/>
+    <w:lvl w:ilvl="0">
+      <w:start w:val="1"/>
+      <w:numFmt w:val="bullet"/>
+      <w:lvlText w:val=""/>
+      <w:lvlJc w:val="left"/>
+      <w:pPr>
+        <w:tabs>
+          <w:tab w:val="num" w:pos="720"/>
+        </w:tabs>
+        <w:ind w:left="720" w:hanging="360"/>
+      </w:pPr>
+      <w:rPr>
+        <w:rFonts w:ascii="Symbol" w:hAnsi="Symbol" w:hint="default"/>
+        <w:sz w:val="20"/>
+      </w:rPr>
+    </w:lvl>
+    <w:lvl w:ilvl="1" w:tentative="1">
+      <w:start w:val="1"/>
+      <w:numFmt w:val="bullet"/>
+      <w:lvlText w:val="o"/>
+      <w:lvlJc w:val="left"/>
+      <w:pPr>
+        <w:tabs>
+          <w:tab w:val="num" w:pos="1440"/>
+        </w:tabs>
+        <w:ind w:left="1440" w:hanging="360"/>
+      </w:pPr>
+      <w:rPr>
+        <w:rFonts w:ascii="Courier New" w:hAnsi="Courier New" w:hint="default"/>
+        <w:sz w:val="20"/>
+      </w:rPr>
+    </w:lvl>
+    <w:lvl w:ilvl="2" w:tentative="1">
+      <w:start w:val="1"/>
+      <w:numFmt w:val="bullet"/>
+      <w:lvlText w:val=""/>
+      <w:lvlJc w:val="left"/>
+      <w:pPr>
+        <w:tabs>
+          <w:tab w:val="num" w:pos="2160"/>
+        </w:tabs>
+        <w:ind w:left="2160" w:hanging="360"/>
+      </w:pPr>
+      <w:rPr>
+        <w:rFonts w:ascii="Wingdings" w:hAnsi="Wingdings" w:hint="default"/>
+        <w:sz w:val="20"/>
+      </w:rPr>
+    </w:lvl>
+    <w:lvl w:ilvl="3" w:tentative="1">
+      <w:start w:val="1"/>
+      <w:numFmt w:val="bullet"/>
+      <w:lvlText w:val=""/>
+      <w:lvlJc w:val="left"/>
+      <w:pPr>
+        <w:tabs>
+          <w:tab w:val="num" w:pos="2880"/>
+        </w:tabs>
+        <w:ind w:left="2880" w:hanging="360"/>
+      </w:pPr>
+      <w:rPr>
+        <w:rFonts w:ascii="Wingdings" w:hAnsi="Wingdings" w:hint="default"/>
+        <w:sz w:val="20"/>
+      </w:rPr>
+    </w:lvl>
+    <w:lvl w:ilvl="4" w:tentative="1">
+      <w:start w:val="1"/>
+      <w:numFmt w:val="bullet"/>
+      <w:lvlText w:val=""/>
+      <w:lvlJc w:val="left"/>
+      <w:pPr>
+        <w:tabs>
+          <w:tab w:val="num" w:pos="3600"/>
+        </w:tabs>
+        <w:ind w:left="3600" w:hanging="360"/>
+      </w:pPr>
+      <w:rPr>
+        <w:rFonts w:ascii="Wingdings" w:hAnsi="Wingdings" w:hint="default"/>
+        <w:sz w:val="20"/>
+      </w:rPr>
+    </w:lvl>
+    <w:lvl w:ilvl="5" w:tentative="1">
+      <w:start w:val="1"/>
+      <w:numFmt w:val="bullet"/>
+      <w:lvlText w:val=""/>
+      <w:lvlJc w:val="left"/>
+      <w:pPr>
+        <w:tabs>
+          <w:tab w:val="num" w:pos="4320"/>
+        </w:tabs>
+        <w:ind w:left="4320" w:hanging="360"/>
+      </w:pPr>
+      <w:rPr>
+        <w:rFonts w:ascii="Wingdings" w:hAnsi="Wingdings" w:hint="default"/>
+        <w:sz w:val="20"/>
+      </w:rPr>
+    </w:lvl>
+    <w:lvl w:ilvl="6" w:tentative="1">
+      <w:start w:val="1"/>
+      <w:numFmt w:val="bullet"/>
+      <w:lvlText w:val=""/>
+      <w:lvlJc w:val="left"/>
+      <w:pPr>
+        <w:tabs>
+          <w:tab w:val="num" w:pos="5040"/>
+        </w:tabs>
+        <w:ind w:left="5040" w:hanging="360"/>
+      </w:pPr>
+      <w:rPr>
+        <w:rFonts w:ascii="Wingdings" w:hAnsi="Wingdings" w:hint="default"/>
+        <w:sz w:val="20"/>
+      </w:rPr>
+    </w:lvl>
+    <w:lvl w:ilvl="7" w:tentative="1">
+      <w:start w:val="1"/>
+      <w:numFmt w:val="bullet"/>
+      <w:lvlText w:val=""/>
+      <w:lvlJc w:val="left"/>
+      <w:pPr>
+        <w:tabs>
+          <w:tab w:val="num" w:pos="5760"/>
+        </w:tabs>
+        <w:ind w:left="5760" w:hanging="360"/>
+      </w:pPr>
+      <w:rPr>
+        <w:rFonts w:ascii="Wingdings" w:hAnsi="Wingdings" w:hint="default"/>
+        <w:sz w:val="20"/>
+      </w:rPr>
+    </w:lvl>
+    <w:lvl w:ilvl="8" w:tentative="1">
+      <w:start w:val="1"/>
+      <w:numFmt w:val="bullet"/>
+      <w:lvlText w:val=""/>
+      <w:lvlJc w:val="left"/>
+      <w:pPr>
+        <w:tabs>
+          <w:tab w:val="num" w:pos="6480"/>
+        </w:tabs>
+        <w:ind w:left="6480" w:hanging="360"/>
+      </w:pPr>
+      <w:rPr>
+        <w:rFonts w:ascii="Wingdings" w:hAnsi="Wingdings" w:hint="default"/>
+        <w:sz w:val="20"/>
+      </w:rPr>
+    </w:lvl>
+  </w:abstractNum>
+  <w:abstractNum w:abstractNumId="6" w15:restartNumberingAfterBreak="0">
+    <w:nsid w:val="536A5252"/>
+    <w:multiLevelType w:val="multilevel"/>
+    <w:tmpl w:val="B11C2494"/>
+    <w:lvl w:ilvl="0">
+      <w:start w:val="1"/>
+      <w:numFmt w:val="bullet"/>
+      <w:lvlText w:val=""/>
+      <w:lvlJc w:val="left"/>
+      <w:pPr>
+        <w:tabs>
+          <w:tab w:val="num" w:pos="720"/>
+        </w:tabs>
+        <w:ind w:left="720" w:hanging="360"/>
+      </w:pPr>
+      <w:rPr>
+        <w:rFonts w:ascii="Symbol" w:hAnsi="Symbol" w:hint="default"/>
+        <w:sz w:val="20"/>
+      </w:rPr>
+    </w:lvl>
+    <w:lvl w:ilvl="1" w:tentative="1">
+      <w:start w:val="1"/>
+      <w:numFmt w:val="bullet"/>
+      <w:lvlText w:val="o"/>
+      <w:lvlJc w:val="left"/>
+      <w:pPr>
+        <w:tabs>
+          <w:tab w:val="num" w:pos="1440"/>
+        </w:tabs>
+        <w:ind w:left="1440" w:hanging="360"/>
+      </w:pPr>
+      <w:rPr>
+        <w:rFonts w:ascii="Courier New" w:hAnsi="Courier New" w:hint="default"/>
+        <w:sz w:val="20"/>
+      </w:rPr>
+    </w:lvl>
+    <w:lvl w:ilvl="2" w:tentative="1">
+      <w:start w:val="1"/>
+      <w:numFmt w:val="bullet"/>
+      <w:lvlText w:val=""/>
+      <w:lvlJc w:val="left"/>
+      <w:pPr>
+        <w:tabs>
+          <w:tab w:val="num" w:pos="2160"/>
+        </w:tabs>
+        <w:ind w:left="2160" w:hanging="360"/>
+      </w:pPr>
+      <w:rPr>
+        <w:rFonts w:ascii="Wingdings" w:hAnsi="Wingdings" w:hint="default"/>
+        <w:sz w:val="20"/>
+      </w:rPr>
+    </w:lvl>
+    <w:lvl w:ilvl="3" w:tentative="1">
+      <w:start w:val="1"/>
+      <w:numFmt w:val="bullet"/>
+      <w:lvlText w:val=""/>
+      <w:lvlJc w:val="left"/>
+      <w:pPr>
+        <w:tabs>
+          <w:tab w:val="num" w:pos="2880"/>
+        </w:tabs>
+        <w:ind w:left="2880" w:hanging="360"/>
+      </w:pPr>
+      <w:rPr>
+        <w:rFonts w:ascii="Wingdings" w:hAnsi="Wingdings" w:hint="default"/>
+        <w:sz w:val="20"/>
+      </w:rPr>
+    </w:lvl>
+    <w:lvl w:ilvl="4" w:tentative="1">
+      <w:start w:val="1"/>
+      <w:numFmt w:val="bullet"/>
+      <w:lvlText w:val=""/>
+      <w:lvlJc w:val="left"/>
+      <w:pPr>
+        <w:tabs>
+          <w:tab w:val="num" w:pos="3600"/>
+        </w:tabs>
+        <w:ind w:left="3600" w:hanging="360"/>
+      </w:pPr>
+      <w:rPr>
+        <w:rFonts w:ascii="Wingdings" w:hAnsi="Wingdings" w:hint="default"/>
+        <w:sz w:val="20"/>
+      </w:rPr>
+    </w:lvl>
+    <w:lvl w:ilvl="5" w:tentative="1">
+      <w:start w:val="1"/>
+      <w:numFmt w:val="bullet"/>
+      <w:lvlText w:val=""/>
+      <w:lvlJc w:val="left"/>
+      <w:pPr>
+        <w:tabs>
+          <w:tab w:val="num" w:pos="4320"/>
+        </w:tabs>
+        <w:ind w:left="4320" w:hanging="360"/>
+      </w:pPr>
+      <w:rPr>
+        <w:rFonts w:ascii="Wingdings" w:hAnsi="Wingdings" w:hint="default"/>
+        <w:sz w:val="20"/>
+      </w:rPr>
+    </w:lvl>
+    <w:lvl w:ilvl="6" w:tentative="1">
+      <w:start w:val="1"/>
+      <w:numFmt w:val="bullet"/>
+      <w:lvlText w:val=""/>
+      <w:lvlJc w:val="left"/>
+      <w:pPr>
+        <w:tabs>
+          <w:tab w:val="num" w:pos="5040"/>
+        </w:tabs>
+        <w:ind w:left="5040" w:hanging="360"/>
+      </w:pPr>
+      <w:rPr>
+        <w:rFonts w:ascii="Wingdings" w:hAnsi="Wingdings" w:hint="default"/>
+        <w:sz w:val="20"/>
+      </w:rPr>
+    </w:lvl>
+    <w:lvl w:ilvl="7" w:tentative="1">
+      <w:start w:val="1"/>
+      <w:numFmt w:val="bullet"/>
+      <w:lvlText w:val=""/>
+      <w:lvlJc w:val="left"/>
+      <w:pPr>
+        <w:tabs>
+          <w:tab w:val="num" w:pos="5760"/>
+        </w:tabs>
+        <w:ind w:left="5760" w:hanging="360"/>
+      </w:pPr>
+      <w:rPr>
+        <w:rFonts w:ascii="Wingdings" w:hAnsi="Wingdings" w:hint="default"/>
+        <w:sz w:val="20"/>
+      </w:rPr>
+    </w:lvl>
+    <w:lvl w:ilvl="8" w:tentative="1">
+      <w:start w:val="1"/>
+      <w:numFmt w:val="bullet"/>
+      <w:lvlText w:val=""/>
+      <w:lvlJc w:val="left"/>
+      <w:pPr>
+        <w:tabs>
+          <w:tab w:val="num" w:pos="6480"/>
+        </w:tabs>
+        <w:ind w:left="6480" w:hanging="360"/>
+      </w:pPr>
+      <w:rPr>
+        <w:rFonts w:ascii="Wingdings" w:hAnsi="Wingdings" w:hint="default"/>
+        <w:sz w:val="20"/>
+      </w:rPr>
+    </w:lvl>
+  </w:abstractNum>
+  <w:abstractNum w:abstractNumId="7" w15:restartNumberingAfterBreak="0">
+    <w:nsid w:val="5E5E7BB0"/>
+    <w:multiLevelType w:val="multilevel"/>
+    <w:tmpl w:val="B33463EC"/>
+    <w:lvl w:ilvl="0">
+      <w:start w:val="1"/>
+      <w:numFmt w:val="decimal"/>
+      <w:lvlText w:val="%1."/>
+      <w:lvlJc w:val="left"/>
+      <w:pPr>
+        <w:tabs>
+          <w:tab w:val="num" w:pos="720"/>
+        </w:tabs>
+        <w:ind w:left="720" w:hanging="360"/>
+      </w:pPr>
+    </w:lvl>
+    <w:lvl w:ilvl="1" w:tentative="1">
+      <w:start w:val="1"/>
+      <w:numFmt w:val="decimal"/>
+      <w:lvlText w:val="%2."/>
+      <w:lvlJc w:val="left"/>
+      <w:pPr>
+        <w:tabs>
+          <w:tab w:val="num" w:pos="1440"/>
+        </w:tabs>
+        <w:ind w:left="1440" w:hanging="360"/>
+      </w:pPr>
+    </w:lvl>
+    <w:lvl w:ilvl="2" w:tentative="1">
+      <w:start w:val="1"/>
+      <w:numFmt w:val="decimal"/>
+      <w:lvlText w:val="%3."/>
+      <w:lvlJc w:val="left"/>
+      <w:pPr>
+        <w:tabs>
+          <w:tab w:val="num" w:pos="2160"/>
+        </w:tabs>
+        <w:ind w:left="2160" w:hanging="360"/>
+      </w:pPr>
+    </w:lvl>
+    <w:lvl w:ilvl="3" w:tentative="1">
+      <w:start w:val="1"/>
+      <w:numFmt w:val="decimal"/>
+      <w:lvlText w:val="%4."/>
+      <w:lvlJc w:val="left"/>
+      <w:pPr>
+        <w:tabs>
+          <w:tab w:val="num" w:pos="2880"/>
+        </w:tabs>
+        <w:ind w:left="2880" w:hanging="360"/>
+      </w:pPr>
+    </w:lvl>
+    <w:lvl w:ilvl="4" w:tentative="1">
+      <w:start w:val="1"/>
+      <w:numFmt w:val="decimal"/>
+      <w:lvlText w:val="%5."/>
+      <w:lvlJc w:val="left"/>
+      <w:pPr>
+        <w:tabs>
+          <w:tab w:val="num" w:pos="3600"/>
+        </w:tabs>
+        <w:ind w:left="3600" w:hanging="360"/>
+      </w:pPr>
+    </w:lvl>
+    <w:lvl w:ilvl="5" w:tentative="1">
+      <w:start w:val="1"/>
+      <w:numFmt w:val="decimal"/>
+      <w:lvlText w:val="%6."/>
+      <w:lvlJc w:val="left"/>
+      <w:pPr>
+        <w:tabs>
+          <w:tab w:val="num" w:pos="4320"/>
+        </w:tabs>
+        <w:ind w:left="4320" w:hanging="360"/>
+      </w:pPr>
+    </w:lvl>
+    <w:lvl w:ilvl="6" w:tentative="1">
+      <w:start w:val="1"/>
+      <w:numFmt w:val="decimal"/>
+      <w:lvlText w:val="%7."/>
+      <w:lvlJc w:val="left"/>
+      <w:pPr>
+        <w:tabs>
+          <w:tab w:val="num" w:pos="5040"/>
+        </w:tabs>
+        <w:ind w:left="5040" w:hanging="360"/>
+      </w:pPr>
+    </w:lvl>
+    <w:lvl w:ilvl="7" w:tentative="1">
+      <w:start w:val="1"/>
+      <w:numFmt w:val="decimal"/>
+      <w:lvlText w:val="%8."/>
+      <w:lvlJc w:val="left"/>
+      <w:pPr>
+        <w:tabs>
+          <w:tab w:val="num" w:pos="5760"/>
+        </w:tabs>
+        <w:ind w:left="5760" w:hanging="360"/>
+      </w:pPr>
+    </w:lvl>
+    <w:lvl w:ilvl="8" w:tentative="1">
+      <w:start w:val="1"/>
+      <w:numFmt w:val="decimal"/>
+      <w:lvlText w:val="%9."/>
+      <w:lvlJc w:val="left"/>
+      <w:pPr>
+        <w:tabs>
+          <w:tab w:val="num" w:pos="6480"/>
+        </w:tabs>
+        <w:ind w:left="6480" w:hanging="360"/>
+      </w:pPr>
+    </w:lvl>
+  </w:abstractNum>
+  <w:abstractNum w:abstractNumId="8" w15:restartNumberingAfterBreak="0">
+    <w:nsid w:val="670A2C89"/>
+    <w:multiLevelType w:val="multilevel"/>
+    <w:tmpl w:val="6FFA24D4"/>
+    <w:lvl w:ilvl="0">
+      <w:start w:val="1"/>
+      <w:numFmt w:val="bullet"/>
+      <w:lvlText w:val=""/>
+      <w:lvlJc w:val="left"/>
+      <w:pPr>
+        <w:tabs>
+          <w:tab w:val="num" w:pos="720"/>
+        </w:tabs>
+        <w:ind w:left="720" w:hanging="360"/>
+      </w:pPr>
+      <w:rPr>
+        <w:rFonts w:ascii="Symbol" w:hAnsi="Symbol" w:hint="default"/>
+        <w:sz w:val="20"/>
+      </w:rPr>
+    </w:lvl>
+    <w:lvl w:ilvl="1" w:tentative="1">
+      <w:start w:val="1"/>
+      <w:numFmt w:val="bullet"/>
+      <w:lvlText w:val="o"/>
+      <w:lvlJc w:val="left"/>
+      <w:pPr>
+        <w:tabs>
+          <w:tab w:val="num" w:pos="1440"/>
+        </w:tabs>
+        <w:ind w:left="1440" w:hanging="360"/>
+      </w:pPr>
+      <w:rPr>
+        <w:rFonts w:ascii="Courier New" w:hAnsi="Courier New" w:hint="default"/>
+        <w:sz w:val="20"/>
+      </w:rPr>
+    </w:lvl>
+    <w:lvl w:ilvl="2" w:tentative="1">
+      <w:start w:val="1"/>
+      <w:numFmt w:val="bullet"/>
+      <w:lvlText w:val=""/>
+      <w:lvlJc w:val="left"/>
+      <w:pPr>
+        <w:tabs>
+          <w:tab w:val="num" w:pos="2160"/>
+        </w:tabs>
+        <w:ind w:left="2160" w:hanging="360"/>
+      </w:pPr>
+      <w:rPr>
+        <w:rFonts w:ascii="Wingdings" w:hAnsi="Wingdings" w:hint="default"/>
+        <w:sz w:val="20"/>
+      </w:rPr>
+    </w:lvl>
+    <w:lvl w:ilvl="3" w:tentative="1">
+      <w:start w:val="1"/>
+      <w:numFmt w:val="bullet"/>
+      <w:lvlText w:val=""/>
+      <w:lvlJc w:val="left"/>
+      <w:pPr>
+        <w:tabs>
+          <w:tab w:val="num" w:pos="2880"/>
+        </w:tabs>
+        <w:ind w:left="2880" w:hanging="360"/>
+      </w:pPr>
+      <w:rPr>
+        <w:rFonts w:ascii="Wingdings" w:hAnsi="Wingdings" w:hint="default"/>
+        <w:sz w:val="20"/>
+      </w:rPr>
+    </w:lvl>
+    <w:lvl w:ilvl="4" w:tentative="1">
+      <w:start w:val="1"/>
+      <w:numFmt w:val="bullet"/>
+      <w:lvlText w:val=""/>
+      <w:lvlJc w:val="left"/>
+      <w:pPr>
+        <w:tabs>
+          <w:tab w:val="num" w:pos="3600"/>
+        </w:tabs>
+        <w:ind w:left="3600" w:hanging="360"/>
+      </w:pPr>
+      <w:rPr>
+        <w:rFonts w:ascii="Wingdings" w:hAnsi="Wingdings" w:hint="default"/>
+        <w:sz w:val="20"/>
+      </w:rPr>
+    </w:lvl>
+    <w:lvl w:ilvl="5" w:tentative="1">
+      <w:start w:val="1"/>
+      <w:numFmt w:val="bullet"/>
+      <w:lvlText w:val=""/>
+      <w:lvlJc w:val="left"/>
+      <w:pPr>
+        <w:tabs>
+          <w:tab w:val="num" w:pos="4320"/>
+        </w:tabs>
+        <w:ind w:left="4320" w:hanging="360"/>
+      </w:pPr>
+      <w:rPr>
+        <w:rFonts w:ascii="Wingdings" w:hAnsi="Wingdings" w:hint="default"/>
+        <w:sz w:val="20"/>
+      </w:rPr>
+    </w:lvl>
+    <w:lvl w:ilvl="6" w:tentative="1">
+      <w:start w:val="1"/>
+      <w:numFmt w:val="bullet"/>
+      <w:lvlText w:val=""/>
+      <w:lvlJc w:val="left"/>
+      <w:pPr>
+        <w:tabs>
+          <w:tab w:val="num" w:pos="5040"/>
+        </w:tabs>
+        <w:ind w:left="5040" w:hanging="360"/>
+      </w:pPr>
+      <w:rPr>
+        <w:rFonts w:ascii="Wingdings" w:hAnsi="Wingdings" w:hint="default"/>
+        <w:sz w:val="20"/>
+      </w:rPr>
+    </w:lvl>
+    <w:lvl w:ilvl="7" w:tentative="1">
+      <w:start w:val="1"/>
+      <w:numFmt w:val="bullet"/>
+      <w:lvlText w:val=""/>
+      <w:lvlJc w:val="left"/>
+      <w:pPr>
+        <w:tabs>
+          <w:tab w:val="num" w:pos="5760"/>
+        </w:tabs>
+        <w:ind w:left="5760" w:hanging="360"/>
+      </w:pPr>
+      <w:rPr>
+        <w:rFonts w:ascii="Wingdings" w:hAnsi="Wingdings" w:hint="default"/>
+        <w:sz w:val="20"/>
+      </w:rPr>
+    </w:lvl>
+    <w:lvl w:ilvl="8" w:tentative="1">
+      <w:start w:val="1"/>
+      <w:numFmt w:val="bullet"/>
+      <w:lvlText w:val=""/>
+      <w:lvlJc w:val="left"/>
+      <w:pPr>
+        <w:tabs>
+          <w:tab w:val="num" w:pos="6480"/>
+        </w:tabs>
+        <w:ind w:left="6480" w:hanging="360"/>
+      </w:pPr>
+      <w:rPr>
+        <w:rFonts w:ascii="Wingdings" w:hAnsi="Wingdings" w:hint="default"/>
+        <w:sz w:val="20"/>
+      </w:rPr>
+    </w:lvl>
+  </w:abstractNum>
+  <w:abstractNum w:abstractNumId="9" w15:restartNumberingAfterBreak="0">
+    <w:nsid w:val="69B21EEC"/>
+    <w:multiLevelType w:val="multilevel"/>
+    <w:tmpl w:val="13CA7F46"/>
+    <w:lvl w:ilvl="0">
+      <w:start w:val="1"/>
+      <w:numFmt w:val="bullet"/>
+      <w:lvlText w:val=""/>
+      <w:lvlJc w:val="left"/>
+      <w:pPr>
+        <w:tabs>
+          <w:tab w:val="num" w:pos="720"/>
+        </w:tabs>
+        <w:ind w:left="720" w:hanging="360"/>
+      </w:pPr>
+      <w:rPr>
+        <w:rFonts w:ascii="Symbol" w:hAnsi="Symbol" w:hint="default"/>
+        <w:sz w:val="20"/>
+      </w:rPr>
+    </w:lvl>
+    <w:lvl w:ilvl="1" w:tentative="1">
+      <w:start w:val="1"/>
+      <w:numFmt w:val="bullet"/>
+      <w:lvlText w:val="o"/>
+      <w:lvlJc w:val="left"/>
+      <w:pPr>
+        <w:tabs>
+          <w:tab w:val="num" w:pos="1440"/>
+        </w:tabs>
+        <w:ind w:left="1440" w:hanging="360"/>
+      </w:pPr>
+      <w:rPr>
+        <w:rFonts w:ascii="Courier New" w:hAnsi="Courier New" w:hint="default"/>
+        <w:sz w:val="20"/>
+      </w:rPr>
+    </w:lvl>
+    <w:lvl w:ilvl="2" w:tentative="1">
+      <w:start w:val="1"/>
+      <w:numFmt w:val="bullet"/>
+      <w:lvlText w:val=""/>
+      <w:lvlJc w:val="left"/>
+      <w:pPr>
+        <w:tabs>
+          <w:tab w:val="num" w:pos="2160"/>
+        </w:tabs>
+        <w:ind w:left="2160" w:hanging="360"/>
+      </w:pPr>
+      <w:rPr>
+        <w:rFonts w:ascii="Wingdings" w:hAnsi="Wingdings" w:hint="default"/>
+        <w:sz w:val="20"/>
+      </w:rPr>
+    </w:lvl>
+    <w:lvl w:ilvl="3" w:tentative="1">
+      <w:start w:val="1"/>
+      <w:numFmt w:val="bullet"/>
+      <w:lvlText w:val=""/>
+      <w:lvlJc w:val="left"/>
+      <w:pPr>
+        <w:tabs>
+          <w:tab w:val="num" w:pos="2880"/>
+        </w:tabs>
+        <w:ind w:left="2880" w:hanging="360"/>
+      </w:pPr>
+      <w:rPr>
+        <w:rFonts w:ascii="Wingdings" w:hAnsi="Wingdings" w:hint="default"/>
+        <w:sz w:val="20"/>
+      </w:rPr>
+    </w:lvl>
+    <w:lvl w:ilvl="4" w:tentative="1">
+      <w:start w:val="1"/>
+      <w:numFmt w:val="bullet"/>
+      <w:lvlText w:val=""/>
+      <w:lvlJc w:val="left"/>
+      <w:pPr>
+        <w:tabs>
+          <w:tab w:val="num" w:pos="3600"/>
+        </w:tabs>
+        <w:ind w:left="3600" w:hanging="360"/>
+      </w:pPr>
+      <w:rPr>
+        <w:rFonts w:ascii="Wingdings" w:hAnsi="Wingdings" w:hint="default"/>
+        <w:sz w:val="20"/>
+      </w:rPr>
+    </w:lvl>
+    <w:lvl w:ilvl="5" w:tentative="1">
+      <w:start w:val="1"/>
+      <w:numFmt w:val="bullet"/>
+      <w:lvlText w:val=""/>
+      <w:lvlJc w:val="left"/>
+      <w:pPr>
+        <w:tabs>
+          <w:tab w:val="num" w:pos="4320"/>
+        </w:tabs>
+        <w:ind w:left="4320" w:hanging="360"/>
+      </w:pPr>
+      <w:rPr>
+        <w:rFonts w:ascii="Wingdings" w:hAnsi="Wingdings" w:hint="default"/>
+        <w:sz w:val="20"/>
+      </w:rPr>
+    </w:lvl>
+    <w:lvl w:ilvl="6" w:tentative="1">
+      <w:start w:val="1"/>
+      <w:numFmt w:val="bullet"/>
+      <w:lvlText w:val=""/>
+      <w:lvlJc w:val="left"/>
+      <w:pPr>
+        <w:tabs>
+          <w:tab w:val="num" w:pos="5040"/>
+        </w:tabs>
+        <w:ind w:left="5040" w:hanging="360"/>
+      </w:pPr>
+      <w:rPr>
+        <w:rFonts w:ascii="Wingdings" w:hAnsi="Wingdings" w:hint="default"/>
+        <w:sz w:val="20"/>
+      </w:rPr>
+    </w:lvl>
+    <w:lvl w:ilvl="7" w:tentative="1">
+      <w:start w:val="1"/>
+      <w:numFmt w:val="bullet"/>
+      <w:lvlText w:val=""/>
+      <w:lvlJc w:val="left"/>
+      <w:pPr>
+        <w:tabs>
+          <w:tab w:val="num" w:pos="5760"/>
+        </w:tabs>
+        <w:ind w:left="5760" w:hanging="360"/>
+      </w:pPr>
+      <w:rPr>
+        <w:rFonts w:ascii="Wingdings" w:hAnsi="Wingdings" w:hint="default"/>
+        <w:sz w:val="20"/>
+      </w:rPr>
+    </w:lvl>
+    <w:lvl w:ilvl="8" w:tentative="1">
+      <w:start w:val="1"/>
+      <w:numFmt w:val="bullet"/>
+      <w:lvlText w:val=""/>
+      <w:lvlJc w:val="left"/>
+      <w:pPr>
+        <w:tabs>
+          <w:tab w:val="num" w:pos="6480"/>
+        </w:tabs>
+        <w:ind w:left="6480" w:hanging="360"/>
+      </w:pPr>
+      <w:rPr>
+        <w:rFonts w:ascii="Wingdings" w:hAnsi="Wingdings" w:hint="default"/>
+        <w:sz w:val="20"/>
+      </w:rPr>
+    </w:lvl>
+  </w:abstractNum>
+  <w:num w:numId="1" w16cid:durableId="1378773662">
+    <w:abstractNumId w:val="6"/>
+  </w:num>
+  <w:num w:numId="2" w16cid:durableId="1442067054">
+    <w:abstractNumId w:val="1"/>
+  </w:num>
+  <w:num w:numId="3" w16cid:durableId="1977298117">
+    <w:abstractNumId w:val="7"/>
+  </w:num>
+  <w:num w:numId="4" w16cid:durableId="1207257235">
+    <w:abstractNumId w:val="5"/>
+  </w:num>
+  <w:num w:numId="5" w16cid:durableId="493492940">
+    <w:abstractNumId w:val="8"/>
+  </w:num>
+  <w:num w:numId="6" w16cid:durableId="1614625912">
+    <w:abstractNumId w:val="0"/>
+  </w:num>
+  <w:num w:numId="7" w16cid:durableId="1321927189">
+    <w:abstractNumId w:val="2"/>
+  </w:num>
+  <w:num w:numId="8" w16cid:durableId="1311441131">
+    <w:abstractNumId w:val="3"/>
+  </w:num>
+  <w:num w:numId="9" w16cid:durableId="138546685">
+    <w:abstractNumId w:val="9"/>
+  </w:num>
+  <w:num w:numId="10" w16cid:durableId="1339580471">
+    <w:abstractNumId w:val="4"/>
+  </w:num>
+</w:numbering>
 </file>
 
 <file path=word/styles.xml><?xml version="1.0" encoding="utf-8"?>
@@ -637,7 +4038,6 @@
   <w:style w:type="character" w:default="1" w:styleId="DefaultParagraphFont">
     <w:name w:val="Default Paragraph Font"/>
     <w:uiPriority w:val="1"/>
-    <w:semiHidden/>
     <w:unhideWhenUsed/>
   </w:style>
   <w:style w:type="table" w:default="1" w:styleId="TableNormal">

</xml_diff>